<commit_message>
Correccion del los requisitos de la solucion completa
</commit_message>
<xml_diff>
--- a/Semana_3/Requerimiento Solucion Completa DevSolve.docx
+++ b/Semana_3/Requerimiento Solucion Completa DevSolve.docx
@@ -24,7 +24,31 @@
           <w:sz w:val="48"/>
           <w:szCs w:val="48"/>
         </w:rPr>
-        <w:t>Especificación Formal de Requerimientos - DevSolve Ecosistema Completo</w:t>
+        <w:t xml:space="preserve">Especificación Formal de Requerimientos: </w:t>
+      </w:r>
+      <w:proofErr w:type="spellStart"/>
+      <w:r>
+        <w:rPr>
+          <w:rFonts w:ascii="Times New Roman" w:eastAsia="Times New Roman" w:hAnsi="Times New Roman" w:cs="Times New Roman"/>
+          <w:b/>
+          <w:bCs/>
+          <w:kern w:val="36"/>
+          <w:sz w:val="48"/>
+          <w:szCs w:val="48"/>
+        </w:rPr>
+        <w:t>DevSolve</w:t>
+      </w:r>
+      <w:proofErr w:type="spellEnd"/>
+      <w:r>
+        <w:rPr>
+          <w:rFonts w:ascii="Times New Roman" w:eastAsia="Times New Roman" w:hAnsi="Times New Roman" w:cs="Times New Roman"/>
+          <w:b/>
+          <w:bCs/>
+          <w:kern w:val="36"/>
+          <w:sz w:val="48"/>
+          <w:szCs w:val="48"/>
+        </w:rPr>
+        <w:t xml:space="preserve"> Ecosistema</w:t>
       </w:r>
     </w:p>
     <w:p>
@@ -77,7 +101,7 @@
       <w:pPr>
         <w:numPr>
           <w:ilvl w:val="0"/>
-          <w:numId w:val="1"/>
+          <w:numId w:val="9"/>
         </w:numPr>
         <w:spacing w:before="100" w:beforeAutospacing="1" w:after="100" w:afterAutospacing="1" w:line="240" w:lineRule="auto"/>
         <w:rPr>
@@ -127,7 +151,7 @@
       <w:pPr>
         <w:numPr>
           <w:ilvl w:val="0"/>
-          <w:numId w:val="1"/>
+          <w:numId w:val="9"/>
         </w:numPr>
         <w:spacing w:before="100" w:beforeAutospacing="1" w:after="100" w:afterAutospacing="1" w:line="240" w:lineRule="auto"/>
         <w:rPr>
@@ -170,14 +194,14 @@
           <w:sz w:val="24"/>
           <w:szCs w:val="24"/>
         </w:rPr>
-        <w:t xml:space="preserve"> validar la identidad corporativa mediante la verificación de dominios de correo, carga de documentos legales y aprobación administrativa manual.</w:t>
+        <w:t xml:space="preserve"> validar empresas mediante la verificación de correo corporativo, carga de documentación legal y aprobación manual administrativa.</w:t>
       </w:r>
     </w:p>
     <w:p>
       <w:pPr>
         <w:numPr>
           <w:ilvl w:val="0"/>
-          <w:numId w:val="1"/>
+          <w:numId w:val="9"/>
         </w:numPr>
         <w:spacing w:before="100" w:beforeAutospacing="1" w:after="100" w:afterAutospacing="1" w:line="240" w:lineRule="auto"/>
         <w:rPr>
@@ -220,14 +244,14 @@
           <w:sz w:val="24"/>
           <w:szCs w:val="24"/>
         </w:rPr>
-        <w:t xml:space="preserve"> generar automáticamente un perfil técnico evolutivo que pondere proyectos finalizados, recurrencia de reutilización y estabilidad de los módulos creados.</w:t>
+        <w:t xml:space="preserve"> construir automáticamente un perfil técnico dinámico basado en proyectos, reutilización de módulos, ingresos generados y tiempo de mantenimiento.</w:t>
       </w:r>
     </w:p>
     <w:p>
       <w:pPr>
         <w:numPr>
           <w:ilvl w:val="0"/>
-          <w:numId w:val="1"/>
+          <w:numId w:val="9"/>
         </w:numPr>
         <w:spacing w:before="100" w:beforeAutospacing="1" w:after="100" w:afterAutospacing="1" w:line="240" w:lineRule="auto"/>
         <w:rPr>
@@ -270,14 +294,32 @@
           <w:sz w:val="24"/>
           <w:szCs w:val="24"/>
         </w:rPr>
-        <w:t xml:space="preserve"> exponer un portafolio público por desarrollador que detalle el historial de versiones, métricas de uso y derivaciones (forks) de sus activos.</w:t>
+        <w:t xml:space="preserve"> exponer un portafolio público que incluya </w:t>
+      </w:r>
+      <w:proofErr w:type="spellStart"/>
+      <w:r>
+        <w:rPr>
+          <w:rFonts w:ascii="Times New Roman" w:eastAsia="Times New Roman" w:hAnsi="Times New Roman" w:cs="Times New Roman"/>
+          <w:sz w:val="24"/>
+          <w:szCs w:val="24"/>
+        </w:rPr>
+        <w:t>forks</w:t>
+      </w:r>
+      <w:proofErr w:type="spellEnd"/>
+      <w:r>
+        <w:rPr>
+          <w:rFonts w:ascii="Times New Roman" w:eastAsia="Times New Roman" w:hAnsi="Times New Roman" w:cs="Times New Roman"/>
+          <w:sz w:val="24"/>
+          <w:szCs w:val="24"/>
+        </w:rPr>
+        <w:t>, adaptaciones, historial de versiones y métricas de uso de cada activo.</w:t>
       </w:r>
     </w:p>
     <w:p>
       <w:pPr>
         <w:numPr>
           <w:ilvl w:val="0"/>
-          <w:numId w:val="1"/>
+          <w:numId w:val="9"/>
         </w:numPr>
         <w:spacing w:before="100" w:beforeAutospacing="1" w:after="100" w:afterAutospacing="1" w:line="240" w:lineRule="auto"/>
         <w:rPr>
@@ -320,7 +362,7 @@
           <w:sz w:val="24"/>
           <w:szCs w:val="24"/>
         </w:rPr>
-        <w:t xml:space="preserve"> aplicar una matriz de permisos granulares según el estado de la relación del usuario con el activo (Propietario, Colaborador, Comprador, Auditor).</w:t>
+        <w:t xml:space="preserve"> administrar permisos específicos según el rol del usuario (propietario, colaborador, comprador, administrador, auditor).</w:t>
       </w:r>
     </w:p>
     <w:p>
@@ -343,14 +385,58 @@
           <w:sz w:val="27"/>
           <w:szCs w:val="27"/>
         </w:rPr>
-        <w:t>1.2 Tablón de Desafíos (Bounty Board)</w:t>
+        <w:t>1.2 Tablón de Desafíos (</w:t>
+      </w:r>
+      <w:proofErr w:type="spellStart"/>
+      <w:r>
+        <w:rPr>
+          <w:rFonts w:ascii="Times New Roman" w:eastAsia="Times New Roman" w:hAnsi="Times New Roman" w:cs="Times New Roman"/>
+          <w:b/>
+          <w:bCs/>
+          <w:sz w:val="27"/>
+          <w:szCs w:val="27"/>
+        </w:rPr>
+        <w:t>Bounty</w:t>
+      </w:r>
+      <w:proofErr w:type="spellEnd"/>
+      <w:r>
+        <w:rPr>
+          <w:rFonts w:ascii="Times New Roman" w:eastAsia="Times New Roman" w:hAnsi="Times New Roman" w:cs="Times New Roman"/>
+          <w:b/>
+          <w:bCs/>
+          <w:sz w:val="27"/>
+          <w:szCs w:val="27"/>
+        </w:rPr>
+        <w:t xml:space="preserve"> </w:t>
+      </w:r>
+      <w:proofErr w:type="spellStart"/>
+      <w:r>
+        <w:rPr>
+          <w:rFonts w:ascii="Times New Roman" w:eastAsia="Times New Roman" w:hAnsi="Times New Roman" w:cs="Times New Roman"/>
+          <w:b/>
+          <w:bCs/>
+          <w:sz w:val="27"/>
+          <w:szCs w:val="27"/>
+        </w:rPr>
+        <w:t>Board</w:t>
+      </w:r>
+      <w:proofErr w:type="spellEnd"/>
+      <w:r>
+        <w:rPr>
+          <w:rFonts w:ascii="Times New Roman" w:eastAsia="Times New Roman" w:hAnsi="Times New Roman" w:cs="Times New Roman"/>
+          <w:b/>
+          <w:bCs/>
+          <w:sz w:val="27"/>
+          <w:szCs w:val="27"/>
+        </w:rPr>
+        <w:t>)</w:t>
       </w:r>
     </w:p>
     <w:p>
       <w:pPr>
         <w:numPr>
           <w:ilvl w:val="0"/>
-          <w:numId w:val="2"/>
+          <w:numId w:val="10"/>
         </w:numPr>
         <w:spacing w:before="100" w:beforeAutospacing="1" w:after="100" w:afterAutospacing="1" w:line="240" w:lineRule="auto"/>
         <w:rPr>
@@ -393,14 +479,14 @@
           <w:sz w:val="24"/>
           <w:szCs w:val="24"/>
         </w:rPr>
-        <w:t xml:space="preserve"> publicar desafíos operativos especificando restricciones técnicas, flujos de trabajo y métricas esperadas de Retorno de Inversión (ROI).</w:t>
+        <w:t xml:space="preserve"> publicar desafíos incluyendo flujos de trabajo, restricciones técnicas, presupuesto y métricas esperadas de ROI.</w:t>
       </w:r>
     </w:p>
     <w:p>
       <w:pPr>
         <w:numPr>
           <w:ilvl w:val="0"/>
-          <w:numId w:val="2"/>
+          <w:numId w:val="10"/>
         </w:numPr>
         <w:spacing w:before="100" w:beforeAutospacing="1" w:after="100" w:afterAutospacing="1" w:line="240" w:lineRule="auto"/>
         <w:rPr>
@@ -443,14 +529,14 @@
           <w:sz w:val="24"/>
           <w:szCs w:val="24"/>
         </w:rPr>
-        <w:t xml:space="preserve"> enviar propuestas competitivas que incluyan la reutilización o adaptación de soluciones existentes en la biblioteca.</w:t>
+        <w:t xml:space="preserve"> enviar propuestas técnicas, estimar tiempos y proponer adaptaciones de herramientas existentes.</w:t>
       </w:r>
     </w:p>
     <w:p>
       <w:pPr>
         <w:numPr>
           <w:ilvl w:val="0"/>
-          <w:numId w:val="2"/>
+          <w:numId w:val="10"/>
         </w:numPr>
         <w:spacing w:before="100" w:beforeAutospacing="1" w:after="100" w:afterAutospacing="1" w:line="240" w:lineRule="auto"/>
         <w:rPr>
@@ -493,14 +579,32 @@
           <w:sz w:val="24"/>
           <w:szCs w:val="24"/>
         </w:rPr>
-        <w:t xml:space="preserve"> retener los fondos en un depósito en garantía (Escrow) y liberarlos únicamente tras la validación de seguridad y publicación en el marketplace.</w:t>
+        <w:t xml:space="preserve"> retener los pagos en un depósito en garantía (</w:t>
+      </w:r>
+      <w:proofErr w:type="spellStart"/>
+      <w:r>
+        <w:rPr>
+          <w:rFonts w:ascii="Times New Roman" w:eastAsia="Times New Roman" w:hAnsi="Times New Roman" w:cs="Times New Roman"/>
+          <w:sz w:val="24"/>
+          <w:szCs w:val="24"/>
+        </w:rPr>
+        <w:t>Escrow</w:t>
+      </w:r>
+      <w:proofErr w:type="spellEnd"/>
+      <w:r>
+        <w:rPr>
+          <w:rFonts w:ascii="Times New Roman" w:eastAsia="Times New Roman" w:hAnsi="Times New Roman" w:cs="Times New Roman"/>
+          <w:sz w:val="24"/>
+          <w:szCs w:val="24"/>
+        </w:rPr>
+        <w:t>) hasta la aprobación de hitos y validación de seguridad.</w:t>
       </w:r>
     </w:p>
     <w:p>
       <w:pPr>
         <w:numPr>
           <w:ilvl w:val="0"/>
-          <w:numId w:val="2"/>
+          <w:numId w:val="10"/>
         </w:numPr>
         <w:spacing w:before="100" w:beforeAutospacing="1" w:after="100" w:afterAutospacing="1" w:line="240" w:lineRule="auto"/>
         <w:rPr>
@@ -543,14 +647,14 @@
           <w:sz w:val="24"/>
           <w:szCs w:val="24"/>
         </w:rPr>
-        <w:t xml:space="preserve"> permitir la gestión de hitos dinámicos con aprobación parcial y desembolsos progresivos por etapas verificadas.</w:t>
+        <w:t xml:space="preserve"> permitir la gestión de múltiples hitos con aprobación parcial y pagos progresivos.</w:t>
       </w:r>
     </w:p>
     <w:p>
       <w:pPr>
         <w:numPr>
           <w:ilvl w:val="0"/>
-          <w:numId w:val="2"/>
+          <w:numId w:val="10"/>
         </w:numPr>
         <w:spacing w:before="100" w:beforeAutospacing="1" w:after="100" w:afterAutospacing="1" w:line="240" w:lineRule="auto"/>
         <w:rPr>
@@ -575,25 +679,25 @@
           <w:sz w:val="24"/>
           <w:szCs w:val="24"/>
         </w:rPr>
-        <w:t xml:space="preserve"> El usuario </w:t>
-      </w:r>
-      <w:r>
-        <w:rPr>
-          <w:rFonts w:ascii="Times New Roman" w:eastAsia="Times New Roman" w:hAnsi="Times New Roman" w:cs="Times New Roman"/>
-          <w:b/>
-          <w:bCs/>
-          <w:sz w:val="24"/>
-          <w:szCs w:val="24"/>
-        </w:rPr>
-        <w:t>puede</w:t>
-      </w:r>
-      <w:r>
-        <w:rPr>
-          <w:rFonts w:ascii="Times New Roman" w:eastAsia="Times New Roman" w:hAnsi="Times New Roman" w:cs="Times New Roman"/>
-          <w:sz w:val="24"/>
-          <w:szCs w:val="24"/>
-        </w:rPr>
-        <w:t xml:space="preserve"> iniciar un proceso de disputa proporcionando evidencia multimedia, la cual será sometida a arbitraje administrativo.</w:t>
+        <w:t xml:space="preserve"> El sistema </w:t>
+      </w:r>
+      <w:r>
+        <w:rPr>
+          <w:rFonts w:ascii="Times New Roman" w:eastAsia="Times New Roman" w:hAnsi="Times New Roman" w:cs="Times New Roman"/>
+          <w:b/>
+          <w:bCs/>
+          <w:sz w:val="24"/>
+          <w:szCs w:val="24"/>
+        </w:rPr>
+        <w:t>debe</w:t>
+      </w:r>
+      <w:r>
+        <w:rPr>
+          <w:rFonts w:ascii="Times New Roman" w:eastAsia="Times New Roman" w:hAnsi="Times New Roman" w:cs="Times New Roman"/>
+          <w:sz w:val="24"/>
+          <w:szCs w:val="24"/>
+        </w:rPr>
+        <w:t xml:space="preserve"> proveer un módulo de gestión de disputas con soporte para evidencia multimedia e historial de decisiones.</w:t>
       </w:r>
     </w:p>
     <w:p>
@@ -616,14 +720,36 @@
           <w:sz w:val="27"/>
           <w:szCs w:val="27"/>
         </w:rPr>
-        <w:t>1.3 Biblioteca de Soluciones y Marketplace</w:t>
+        <w:t>1.3 Biblioteca de Soluciones (</w:t>
+      </w:r>
+      <w:proofErr w:type="spellStart"/>
+      <w:r>
+        <w:rPr>
+          <w:rFonts w:ascii="Times New Roman" w:eastAsia="Times New Roman" w:hAnsi="Times New Roman" w:cs="Times New Roman"/>
+          <w:b/>
+          <w:bCs/>
+          <w:sz w:val="27"/>
+          <w:szCs w:val="27"/>
+        </w:rPr>
+        <w:t>Solution</w:t>
+      </w:r>
+      <w:proofErr w:type="spellEnd"/>
+      <w:r>
+        <w:rPr>
+          <w:rFonts w:ascii="Times New Roman" w:eastAsia="Times New Roman" w:hAnsi="Times New Roman" w:cs="Times New Roman"/>
+          <w:b/>
+          <w:bCs/>
+          <w:sz w:val="27"/>
+          <w:szCs w:val="27"/>
+        </w:rPr>
+        <w:t xml:space="preserve"> Library)</w:t>
       </w:r>
     </w:p>
     <w:p>
       <w:pPr>
         <w:numPr>
           <w:ilvl w:val="0"/>
-          <w:numId w:val="3"/>
+          <w:numId w:val="11"/>
         </w:numPr>
         <w:spacing w:before="100" w:beforeAutospacing="1" w:after="100" w:afterAutospacing="1" w:line="240" w:lineRule="auto"/>
         <w:rPr>
@@ -666,14 +792,50 @@
           <w:sz w:val="24"/>
           <w:szCs w:val="24"/>
         </w:rPr>
-        <w:t xml:space="preserve"> indexar y almacenar aplicaciones completas, APIs, módulos y automatizaciones como activos independientes.</w:t>
+        <w:t xml:space="preserve"> almacenar y publicar aplicaciones completas, </w:t>
+      </w:r>
+      <w:proofErr w:type="spellStart"/>
+      <w:r>
+        <w:rPr>
+          <w:rFonts w:ascii="Times New Roman" w:eastAsia="Times New Roman" w:hAnsi="Times New Roman" w:cs="Times New Roman"/>
+          <w:sz w:val="24"/>
+          <w:szCs w:val="24"/>
+        </w:rPr>
+        <w:t>APIs</w:t>
+      </w:r>
+      <w:proofErr w:type="spellEnd"/>
+      <w:r>
+        <w:rPr>
+          <w:rFonts w:ascii="Times New Roman" w:eastAsia="Times New Roman" w:hAnsi="Times New Roman" w:cs="Times New Roman"/>
+          <w:sz w:val="24"/>
+          <w:szCs w:val="24"/>
+        </w:rPr>
+        <w:t xml:space="preserve">, módulos y automatizaciones en un </w:t>
+      </w:r>
+      <w:proofErr w:type="spellStart"/>
+      <w:r>
+        <w:rPr>
+          <w:rFonts w:ascii="Times New Roman" w:eastAsia="Times New Roman" w:hAnsi="Times New Roman" w:cs="Times New Roman"/>
+          <w:sz w:val="24"/>
+          <w:szCs w:val="24"/>
+        </w:rPr>
+        <w:t>marketplace</w:t>
+      </w:r>
+      <w:proofErr w:type="spellEnd"/>
+      <w:r>
+        <w:rPr>
+          <w:rFonts w:ascii="Times New Roman" w:eastAsia="Times New Roman" w:hAnsi="Times New Roman" w:cs="Times New Roman"/>
+          <w:sz w:val="24"/>
+          <w:szCs w:val="24"/>
+        </w:rPr>
+        <w:t xml:space="preserve"> centralizado.</w:t>
       </w:r>
     </w:p>
     <w:p>
       <w:pPr>
         <w:numPr>
           <w:ilvl w:val="0"/>
-          <w:numId w:val="3"/>
+          <w:numId w:val="11"/>
         </w:numPr>
         <w:spacing w:before="100" w:beforeAutospacing="1" w:after="100" w:afterAutospacing="1" w:line="240" w:lineRule="auto"/>
         <w:rPr>
@@ -716,14 +878,14 @@
           <w:sz w:val="24"/>
           <w:szCs w:val="24"/>
         </w:rPr>
-        <w:t xml:space="preserve"> organizar el catálogo basándose en el impacto económico y la categoría industrial de la solución.</w:t>
+        <w:t xml:space="preserve"> indexar las soluciones basándose en necesidades empresariales, procesos operativos e impacto económico.</w:t>
       </w:r>
     </w:p>
     <w:p>
       <w:pPr>
         <w:numPr>
           <w:ilvl w:val="0"/>
-          <w:numId w:val="3"/>
+          <w:numId w:val="11"/>
         </w:numPr>
         <w:spacing w:before="100" w:beforeAutospacing="1" w:after="100" w:afterAutospacing="1" w:line="240" w:lineRule="auto"/>
         <w:rPr>
@@ -748,32 +910,32 @@
           <w:sz w:val="24"/>
           <w:szCs w:val="24"/>
         </w:rPr>
-        <w:t xml:space="preserve"> El usuario </w:t>
-      </w:r>
-      <w:r>
-        <w:rPr>
-          <w:rFonts w:ascii="Times New Roman" w:eastAsia="Times New Roman" w:hAnsi="Times New Roman" w:cs="Times New Roman"/>
-          <w:b/>
-          <w:bCs/>
-          <w:sz w:val="24"/>
-          <w:szCs w:val="24"/>
-        </w:rPr>
-        <w:t>puede</w:t>
-      </w:r>
-      <w:r>
-        <w:rPr>
-          <w:rFonts w:ascii="Times New Roman" w:eastAsia="Times New Roman" w:hAnsi="Times New Roman" w:cs="Times New Roman"/>
-          <w:sz w:val="24"/>
-          <w:szCs w:val="24"/>
-        </w:rPr>
-        <w:t xml:space="preserve"> localizar soluciones mediante consultas en lenguaje natural y filtros de similitud funcional.</w:t>
+        <w:t xml:space="preserve"> El sistema </w:t>
+      </w:r>
+      <w:r>
+        <w:rPr>
+          <w:rFonts w:ascii="Times New Roman" w:eastAsia="Times New Roman" w:hAnsi="Times New Roman" w:cs="Times New Roman"/>
+          <w:b/>
+          <w:bCs/>
+          <w:sz w:val="24"/>
+          <w:szCs w:val="24"/>
+        </w:rPr>
+        <w:t>debe</w:t>
+      </w:r>
+      <w:r>
+        <w:rPr>
+          <w:rFonts w:ascii="Times New Roman" w:eastAsia="Times New Roman" w:hAnsi="Times New Roman" w:cs="Times New Roman"/>
+          <w:sz w:val="24"/>
+          <w:szCs w:val="24"/>
+        </w:rPr>
+        <w:t xml:space="preserve"> proveer un buscador inteligente con soporte para lenguaje natural, etiquetas y similitud funcional.</w:t>
       </w:r>
     </w:p>
     <w:p>
       <w:pPr>
         <w:numPr>
           <w:ilvl w:val="0"/>
-          <w:numId w:val="3"/>
+          <w:numId w:val="11"/>
         </w:numPr>
         <w:spacing w:before="100" w:beforeAutospacing="1" w:after="100" w:afterAutospacing="1" w:line="240" w:lineRule="auto"/>
         <w:rPr>
@@ -790,7 +952,6 @@
           <w:sz w:val="24"/>
           <w:szCs w:val="24"/>
         </w:rPr>
-        <w:lastRenderedPageBreak/>
         <w:t>RF-14:</w:t>
       </w:r>
       <w:r>
@@ -817,14 +978,32 @@
           <w:sz w:val="24"/>
           <w:szCs w:val="24"/>
         </w:rPr>
-        <w:t xml:space="preserve"> mantener un control de versiones estricto, permitiendo la coexistencia de versiones originales y ramas derivadas (forks).</w:t>
+        <w:t xml:space="preserve"> mantener el historial de versiones, ramas derivadas (</w:t>
+      </w:r>
+      <w:proofErr w:type="spellStart"/>
+      <w:r>
+        <w:rPr>
+          <w:rFonts w:ascii="Times New Roman" w:eastAsia="Times New Roman" w:hAnsi="Times New Roman" w:cs="Times New Roman"/>
+          <w:sz w:val="24"/>
+          <w:szCs w:val="24"/>
+        </w:rPr>
+        <w:t>forks</w:t>
+      </w:r>
+      <w:proofErr w:type="spellEnd"/>
+      <w:r>
+        <w:rPr>
+          <w:rFonts w:ascii="Times New Roman" w:eastAsia="Times New Roman" w:hAnsi="Times New Roman" w:cs="Times New Roman"/>
+          <w:sz w:val="24"/>
+          <w:szCs w:val="24"/>
+        </w:rPr>
+        <w:t>) y compatibilidad entre las mismas.</w:t>
       </w:r>
     </w:p>
     <w:p>
       <w:pPr>
         <w:numPr>
           <w:ilvl w:val="0"/>
-          <w:numId w:val="3"/>
+          <w:numId w:val="11"/>
         </w:numPr>
         <w:spacing w:before="100" w:beforeAutospacing="1" w:after="100" w:afterAutospacing="1" w:line="240" w:lineRule="auto"/>
         <w:rPr>
@@ -841,6 +1020,7 @@
           <w:sz w:val="24"/>
           <w:szCs w:val="24"/>
         </w:rPr>
+        <w:lastRenderedPageBreak/>
         <w:t>RF-15:</w:t>
       </w:r>
       <w:r>
@@ -867,7 +1047,25 @@
           <w:sz w:val="24"/>
           <w:szCs w:val="24"/>
         </w:rPr>
-        <w:t xml:space="preserve"> registrar automáticamente toda solución finalizada en el marketplace, prohibiendo la ocultación de la existencia del activo.</w:t>
+        <w:t xml:space="preserve"> registrar automáticamente toda solución desarrollada como activo reutilizable, permitiendo al desarrollador definir </w:t>
+      </w:r>
+      <w:proofErr w:type="gramStart"/>
+      <w:r>
+        <w:rPr>
+          <w:rFonts w:ascii="Times New Roman" w:eastAsia="Times New Roman" w:hAnsi="Times New Roman" w:cs="Times New Roman"/>
+          <w:sz w:val="24"/>
+          <w:szCs w:val="24"/>
+        </w:rPr>
+        <w:t>licencias</w:t>
+      </w:r>
+      <w:proofErr w:type="gramEnd"/>
+      <w:r>
+        <w:rPr>
+          <w:rFonts w:ascii="Times New Roman" w:eastAsia="Times New Roman" w:hAnsi="Times New Roman" w:cs="Times New Roman"/>
+          <w:sz w:val="24"/>
+          <w:szCs w:val="24"/>
+        </w:rPr>
+        <w:t xml:space="preserve"> pero no ocultar el activo.</w:t>
       </w:r>
     </w:p>
     <w:p>
@@ -890,14 +1088,14 @@
           <w:sz w:val="27"/>
           <w:szCs w:val="27"/>
         </w:rPr>
-        <w:t>1.4 Motor de Licenciamiento y Regalías</w:t>
+        <w:t>1.4 Motor de Licenciamiento y Reventa</w:t>
       </w:r>
     </w:p>
     <w:p>
       <w:pPr>
         <w:numPr>
           <w:ilvl w:val="0"/>
-          <w:numId w:val="4"/>
+          <w:numId w:val="12"/>
         </w:numPr>
         <w:spacing w:before="100" w:beforeAutospacing="1" w:after="100" w:afterAutospacing="1" w:line="240" w:lineRule="auto"/>
         <w:rPr>
@@ -940,14 +1138,14 @@
           <w:sz w:val="24"/>
           <w:szCs w:val="24"/>
         </w:rPr>
-        <w:t xml:space="preserve"> emitir contratos digitales que definan los derechos de modificación, distribución y reglas de reventa de forma automática.</w:t>
+        <w:t xml:space="preserve"> generar contratos digitales automáticos que definan permisos de uso, reventa y porcentajes de regalías.</w:t>
       </w:r>
     </w:p>
     <w:p>
       <w:pPr>
         <w:numPr>
           <w:ilvl w:val="0"/>
-          <w:numId w:val="4"/>
+          <w:numId w:val="12"/>
         </w:numPr>
         <w:spacing w:before="100" w:beforeAutospacing="1" w:after="100" w:afterAutospacing="1" w:line="240" w:lineRule="auto"/>
         <w:rPr>
@@ -990,14 +1188,14 @@
           <w:sz w:val="24"/>
           <w:szCs w:val="24"/>
         </w:rPr>
-        <w:t xml:space="preserve"> procesar micro-pagos basados en ejecución, suscripciones temporales o licencias permanentes.</w:t>
+        <w:t xml:space="preserve"> permitir modelos de monetización por ejecución, suscripción temporal o licencias permanentes.</w:t>
       </w:r>
     </w:p>
     <w:p>
       <w:pPr>
         <w:numPr>
           <w:ilvl w:val="0"/>
-          <w:numId w:val="4"/>
+          <w:numId w:val="12"/>
         </w:numPr>
         <w:spacing w:before="100" w:beforeAutospacing="1" w:after="100" w:afterAutospacing="1" w:line="240" w:lineRule="auto"/>
         <w:rPr>
@@ -1040,11 +1238,61 @@
           <w:sz w:val="24"/>
           <w:szCs w:val="24"/>
         </w:rPr>
-        <w:t xml:space="preserve"> ejecutar un motor de regalías en cascada para distribuir ingresos proporcionalmente entre el autor principal y los creadores de dependencias internas.</w:t>
+        <w:t xml:space="preserve"> distribuir ingresos automáticamente entre el desarrollador, los creadores de módulos utilizados y la plataforma.</w:t>
       </w:r>
     </w:p>
     <w:p>
       <w:pPr>
+        <w:numPr>
+          <w:ilvl w:val="0"/>
+          <w:numId w:val="12"/>
+        </w:numPr>
+        <w:spacing w:before="100" w:beforeAutospacing="1" w:after="100" w:afterAutospacing="1" w:line="240" w:lineRule="auto"/>
+        <w:rPr>
+          <w:rFonts w:ascii="Times New Roman" w:eastAsia="Times New Roman" w:hAnsi="Times New Roman" w:cs="Times New Roman"/>
+          <w:sz w:val="24"/>
+          <w:szCs w:val="24"/>
+        </w:rPr>
+      </w:pPr>
+      <w:r>
+        <w:rPr>
+          <w:rFonts w:ascii="Times New Roman" w:eastAsia="Times New Roman" w:hAnsi="Times New Roman" w:cs="Times New Roman"/>
+          <w:b/>
+          <w:bCs/>
+          <w:sz w:val="24"/>
+          <w:szCs w:val="24"/>
+        </w:rPr>
+        <w:t>RF-19:</w:t>
+      </w:r>
+      <w:r>
+        <w:rPr>
+          <w:rFonts w:ascii="Times New Roman" w:eastAsia="Times New Roman" w:hAnsi="Times New Roman" w:cs="Times New Roman"/>
+          <w:sz w:val="24"/>
+          <w:szCs w:val="24"/>
+        </w:rPr>
+        <w:t xml:space="preserve"> El sistema </w:t>
+      </w:r>
+      <w:r>
+        <w:rPr>
+          <w:rFonts w:ascii="Times New Roman" w:eastAsia="Times New Roman" w:hAnsi="Times New Roman" w:cs="Times New Roman"/>
+          <w:b/>
+          <w:bCs/>
+          <w:sz w:val="24"/>
+          <w:szCs w:val="24"/>
+        </w:rPr>
+        <w:t>debe</w:t>
+      </w:r>
+      <w:r>
+        <w:rPr>
+          <w:rFonts w:ascii="Times New Roman" w:eastAsia="Times New Roman" w:hAnsi="Times New Roman" w:cs="Times New Roman"/>
+          <w:sz w:val="24"/>
+          <w:szCs w:val="24"/>
+        </w:rPr>
+        <w:t xml:space="preserve"> ejecutar un cálculo de regalías en cascada para pagar proporcionalmente a todos los propietarios de dependencias internas.</w:t>
+      </w:r>
+    </w:p>
+    <w:p>
+      <w:pPr>
         <w:spacing w:before="100" w:beforeAutospacing="1" w:after="100" w:afterAutospacing="1" w:line="240" w:lineRule="auto"/>
         <w:outlineLvl w:val="2"/>
         <w:rPr>
@@ -1063,14 +1311,36 @@
           <w:sz w:val="27"/>
           <w:szCs w:val="27"/>
         </w:rPr>
-        <w:t>1.5 Entorno de Ejecución (Cloud Runtime)</w:t>
+        <w:t xml:space="preserve">1.5 Entorno de Ejecución en la Nube (Cloud </w:t>
+      </w:r>
+      <w:proofErr w:type="spellStart"/>
+      <w:r>
+        <w:rPr>
+          <w:rFonts w:ascii="Times New Roman" w:eastAsia="Times New Roman" w:hAnsi="Times New Roman" w:cs="Times New Roman"/>
+          <w:b/>
+          <w:bCs/>
+          <w:sz w:val="27"/>
+          <w:szCs w:val="27"/>
+        </w:rPr>
+        <w:t>Runtime</w:t>
+      </w:r>
+      <w:proofErr w:type="spellEnd"/>
+      <w:r>
+        <w:rPr>
+          <w:rFonts w:ascii="Times New Roman" w:eastAsia="Times New Roman" w:hAnsi="Times New Roman" w:cs="Times New Roman"/>
+          <w:b/>
+          <w:bCs/>
+          <w:sz w:val="27"/>
+          <w:szCs w:val="27"/>
+        </w:rPr>
+        <w:t>)</w:t>
       </w:r>
     </w:p>
     <w:p>
       <w:pPr>
         <w:numPr>
           <w:ilvl w:val="0"/>
-          <w:numId w:val="5"/>
+          <w:numId w:val="13"/>
         </w:numPr>
         <w:spacing w:before="100" w:beforeAutospacing="1" w:after="100" w:afterAutospacing="1" w:line="240" w:lineRule="auto"/>
         <w:rPr>
@@ -1087,7 +1357,7 @@
           <w:sz w:val="24"/>
           <w:szCs w:val="24"/>
         </w:rPr>
-        <w:t>RF-19:</w:t>
+        <w:t>RF-20:</w:t>
       </w:r>
       <w:r>
         <w:rPr>
@@ -1113,14 +1383,32 @@
           <w:sz w:val="24"/>
           <w:szCs w:val="24"/>
         </w:rPr>
-        <w:t xml:space="preserve"> proveer un entorno de ejecución en la nube que permita el despliegue de aplicaciones sin requerir instalación local por parte del cliente.</w:t>
+        <w:t xml:space="preserve"> permitir la ejecución de aplicaciones directamente desde la infraestructura </w:t>
+      </w:r>
+      <w:proofErr w:type="spellStart"/>
+      <w:r>
+        <w:rPr>
+          <w:rFonts w:ascii="Times New Roman" w:eastAsia="Times New Roman" w:hAnsi="Times New Roman" w:cs="Times New Roman"/>
+          <w:sz w:val="24"/>
+          <w:szCs w:val="24"/>
+        </w:rPr>
+        <w:t>cloud</w:t>
+      </w:r>
+      <w:proofErr w:type="spellEnd"/>
+      <w:r>
+        <w:rPr>
+          <w:rFonts w:ascii="Times New Roman" w:eastAsia="Times New Roman" w:hAnsi="Times New Roman" w:cs="Times New Roman"/>
+          <w:sz w:val="24"/>
+          <w:szCs w:val="24"/>
+        </w:rPr>
+        <w:t xml:space="preserve"> de la plataforma.</w:t>
       </w:r>
     </w:p>
     <w:p>
       <w:pPr>
         <w:numPr>
           <w:ilvl w:val="0"/>
-          <w:numId w:val="5"/>
+          <w:numId w:val="13"/>
         </w:numPr>
         <w:spacing w:before="100" w:beforeAutospacing="1" w:after="100" w:afterAutospacing="1" w:line="240" w:lineRule="auto"/>
         <w:rPr>
@@ -1137,7 +1425,7 @@
           <w:sz w:val="24"/>
           <w:szCs w:val="24"/>
         </w:rPr>
-        <w:t>RF-20:</w:t>
+        <w:t>RF-21:</w:t>
       </w:r>
       <w:r>
         <w:rPr>
@@ -1163,14 +1451,14 @@
           <w:sz w:val="24"/>
           <w:szCs w:val="24"/>
         </w:rPr>
-        <w:t xml:space="preserve"> garantizar el aislamiento de procesos y datos mediante entornos virtualizados independientes para cada solución ejecutada.</w:t>
+        <w:t xml:space="preserve"> garantizar el aislamiento de entornos para proteger la integridad de los datos y evitar interferencias.</w:t>
       </w:r>
     </w:p>
     <w:p>
       <w:pPr>
         <w:numPr>
           <w:ilvl w:val="0"/>
-          <w:numId w:val="5"/>
+          <w:numId w:val="13"/>
         </w:numPr>
         <w:spacing w:before="100" w:beforeAutospacing="1" w:after="100" w:afterAutospacing="1" w:line="240" w:lineRule="auto"/>
         <w:rPr>
@@ -1187,7 +1475,7 @@
           <w:sz w:val="24"/>
           <w:szCs w:val="24"/>
         </w:rPr>
-        <w:t>RF-21:</w:t>
+        <w:t>RF-22:</w:t>
       </w:r>
       <w:r>
         <w:rPr>
@@ -1213,11 +1501,147 @@
           <w:sz w:val="24"/>
           <w:szCs w:val="24"/>
         </w:rPr>
-        <w:t xml:space="preserve"> monitorizar y limitar el consumo de recursos (CPU, RAM, Almacenamiento) según el plan de suscripción o licencia del usuario.</w:t>
+        <w:t xml:space="preserve"> controlar y limitar el uso de CPU, memoria, almacenamiento y concurrencia por cada instancia.</w:t>
       </w:r>
     </w:p>
     <w:p>
       <w:pPr>
+        <w:numPr>
+          <w:ilvl w:val="0"/>
+          <w:numId w:val="13"/>
+        </w:numPr>
+        <w:spacing w:before="100" w:beforeAutospacing="1" w:after="100" w:afterAutospacing="1" w:line="240" w:lineRule="auto"/>
+        <w:rPr>
+          <w:rFonts w:ascii="Times New Roman" w:eastAsia="Times New Roman" w:hAnsi="Times New Roman" w:cs="Times New Roman"/>
+          <w:sz w:val="24"/>
+          <w:szCs w:val="24"/>
+        </w:rPr>
+      </w:pPr>
+      <w:r>
+        <w:rPr>
+          <w:rFonts w:ascii="Times New Roman" w:eastAsia="Times New Roman" w:hAnsi="Times New Roman" w:cs="Times New Roman"/>
+          <w:b/>
+          <w:bCs/>
+          <w:sz w:val="24"/>
+          <w:szCs w:val="24"/>
+        </w:rPr>
+        <w:t>RF-23:</w:t>
+      </w:r>
+      <w:r>
+        <w:rPr>
+          <w:rFonts w:ascii="Times New Roman" w:eastAsia="Times New Roman" w:hAnsi="Times New Roman" w:cs="Times New Roman"/>
+          <w:sz w:val="24"/>
+          <w:szCs w:val="24"/>
+        </w:rPr>
+        <w:t xml:space="preserve"> El sistema </w:t>
+      </w:r>
+      <w:r>
+        <w:rPr>
+          <w:rFonts w:ascii="Times New Roman" w:eastAsia="Times New Roman" w:hAnsi="Times New Roman" w:cs="Times New Roman"/>
+          <w:b/>
+          <w:bCs/>
+          <w:sz w:val="24"/>
+          <w:szCs w:val="24"/>
+        </w:rPr>
+        <w:t>debe</w:t>
+      </w:r>
+      <w:r>
+        <w:rPr>
+          <w:rFonts w:ascii="Times New Roman" w:eastAsia="Times New Roman" w:hAnsi="Times New Roman" w:cs="Times New Roman"/>
+          <w:sz w:val="24"/>
+          <w:szCs w:val="24"/>
+        </w:rPr>
+        <w:t xml:space="preserve"> automatizar el despliegue, permitiendo actualizaciones continuas y </w:t>
+      </w:r>
+      <w:proofErr w:type="spellStart"/>
+      <w:r>
+        <w:rPr>
+          <w:rFonts w:ascii="Times New Roman" w:eastAsia="Times New Roman" w:hAnsi="Times New Roman" w:cs="Times New Roman"/>
+          <w:sz w:val="24"/>
+          <w:szCs w:val="24"/>
+        </w:rPr>
+        <w:t>rollback</w:t>
+      </w:r>
+      <w:proofErr w:type="spellEnd"/>
+      <w:r>
+        <w:rPr>
+          <w:rFonts w:ascii="Times New Roman" w:eastAsia="Times New Roman" w:hAnsi="Times New Roman" w:cs="Times New Roman"/>
+          <w:sz w:val="24"/>
+          <w:szCs w:val="24"/>
+        </w:rPr>
+        <w:t xml:space="preserve"> de versiones.</w:t>
+      </w:r>
+    </w:p>
+    <w:p>
+      <w:pPr>
+        <w:numPr>
+          <w:ilvl w:val="0"/>
+          <w:numId w:val="13"/>
+        </w:numPr>
+        <w:spacing w:before="100" w:beforeAutospacing="1" w:after="100" w:afterAutospacing="1" w:line="240" w:lineRule="auto"/>
+        <w:rPr>
+          <w:rFonts w:ascii="Times New Roman" w:eastAsia="Times New Roman" w:hAnsi="Times New Roman" w:cs="Times New Roman"/>
+          <w:sz w:val="24"/>
+          <w:szCs w:val="24"/>
+        </w:rPr>
+      </w:pPr>
+      <w:r>
+        <w:rPr>
+          <w:rFonts w:ascii="Times New Roman" w:eastAsia="Times New Roman" w:hAnsi="Times New Roman" w:cs="Times New Roman"/>
+          <w:b/>
+          <w:bCs/>
+          <w:sz w:val="24"/>
+          <w:szCs w:val="24"/>
+        </w:rPr>
+        <w:t>RF-24:</w:t>
+      </w:r>
+      <w:r>
+        <w:rPr>
+          <w:rFonts w:ascii="Times New Roman" w:eastAsia="Times New Roman" w:hAnsi="Times New Roman" w:cs="Times New Roman"/>
+          <w:sz w:val="24"/>
+          <w:szCs w:val="24"/>
+        </w:rPr>
+        <w:t xml:space="preserve"> El usuario </w:t>
+      </w:r>
+      <w:r>
+        <w:rPr>
+          <w:rFonts w:ascii="Times New Roman" w:eastAsia="Times New Roman" w:hAnsi="Times New Roman" w:cs="Times New Roman"/>
+          <w:b/>
+          <w:bCs/>
+          <w:sz w:val="24"/>
+          <w:szCs w:val="24"/>
+        </w:rPr>
+        <w:t>puede</w:t>
+      </w:r>
+      <w:r>
+        <w:rPr>
+          <w:rFonts w:ascii="Times New Roman" w:eastAsia="Times New Roman" w:hAnsi="Times New Roman" w:cs="Times New Roman"/>
+          <w:sz w:val="24"/>
+          <w:szCs w:val="24"/>
+        </w:rPr>
+        <w:t xml:space="preserve"> crear versiones derivadas (</w:t>
+      </w:r>
+      <w:proofErr w:type="spellStart"/>
+      <w:r>
+        <w:rPr>
+          <w:rFonts w:ascii="Times New Roman" w:eastAsia="Times New Roman" w:hAnsi="Times New Roman" w:cs="Times New Roman"/>
+          <w:sz w:val="24"/>
+          <w:szCs w:val="24"/>
+        </w:rPr>
+        <w:t>forks</w:t>
+      </w:r>
+      <w:proofErr w:type="spellEnd"/>
+      <w:r>
+        <w:rPr>
+          <w:rFonts w:ascii="Times New Roman" w:eastAsia="Times New Roman" w:hAnsi="Times New Roman" w:cs="Times New Roman"/>
+          <w:sz w:val="24"/>
+          <w:szCs w:val="24"/>
+        </w:rPr>
+        <w:t>) en el entorno de ejecución sin afectar la versión original.</w:t>
+      </w:r>
+    </w:p>
+    <w:p>
+      <w:pPr>
         <w:spacing w:before="100" w:beforeAutospacing="1" w:after="100" w:afterAutospacing="1" w:line="240" w:lineRule="auto"/>
         <w:outlineLvl w:val="2"/>
         <w:rPr>
@@ -1236,14 +1660,14 @@
           <w:sz w:val="27"/>
           <w:szCs w:val="27"/>
         </w:rPr>
-        <w:t>1.6 Inteligencia Asistida y Seguridad</w:t>
+        <w:t>1.6 Inteligencia Asistida y Automatización</w:t>
       </w:r>
     </w:p>
     <w:p>
       <w:pPr>
         <w:numPr>
           <w:ilvl w:val="0"/>
-          <w:numId w:val="6"/>
+          <w:numId w:val="14"/>
         </w:numPr>
         <w:spacing w:before="100" w:beforeAutospacing="1" w:after="100" w:afterAutospacing="1" w:line="240" w:lineRule="auto"/>
         <w:rPr>
@@ -1260,7 +1684,7 @@
           <w:sz w:val="24"/>
           <w:szCs w:val="24"/>
         </w:rPr>
-        <w:t>RF-22:</w:t>
+        <w:t>RF-25:</w:t>
       </w:r>
       <w:r>
         <w:rPr>
@@ -1286,14 +1710,14 @@
           <w:sz w:val="24"/>
           <w:szCs w:val="24"/>
         </w:rPr>
-        <w:t xml:space="preserve"> asistir al usuario mediante un intérprete técnico para la redacción de requerimientos y especificaciones funcionales.</w:t>
+        <w:t xml:space="preserve"> asistir al usuario en la redacción de requisitos y definición de objetivos mediante un intérprete técnico.</w:t>
       </w:r>
     </w:p>
     <w:p>
       <w:pPr>
         <w:numPr>
           <w:ilvl w:val="0"/>
-          <w:numId w:val="6"/>
+          <w:numId w:val="14"/>
         </w:numPr>
         <w:spacing w:before="100" w:beforeAutospacing="1" w:after="100" w:afterAutospacing="1" w:line="240" w:lineRule="auto"/>
         <w:rPr>
@@ -1310,7 +1734,7 @@
           <w:sz w:val="24"/>
           <w:szCs w:val="24"/>
         </w:rPr>
-        <w:t>RF-23:</w:t>
+        <w:t>RF-26:</w:t>
       </w:r>
       <w:r>
         <w:rPr>
@@ -1336,14 +1760,14 @@
           <w:sz w:val="24"/>
           <w:szCs w:val="24"/>
         </w:rPr>
-        <w:t xml:space="preserve"> realizar un escaneo obligatorio de seguridad (malware, vulnerabilidades y dependencias) a toda solución antes de su publicación.</w:t>
+        <w:t xml:space="preserve"> sugerir soluciones similares o módulos compatibles antes de la publicación de un nuevo desafío.</w:t>
       </w:r>
     </w:p>
     <w:p>
       <w:pPr>
         <w:numPr>
           <w:ilvl w:val="0"/>
-          <w:numId w:val="6"/>
+          <w:numId w:val="14"/>
         </w:numPr>
         <w:spacing w:before="100" w:beforeAutospacing="1" w:after="100" w:afterAutospacing="1" w:line="240" w:lineRule="auto"/>
         <w:rPr>
@@ -1360,7 +1784,7 @@
           <w:sz w:val="24"/>
           <w:szCs w:val="24"/>
         </w:rPr>
-        <w:t>RF-24:</w:t>
+        <w:t>RF-27:</w:t>
       </w:r>
       <w:r>
         <w:rPr>
@@ -1386,7 +1810,7 @@
           <w:sz w:val="24"/>
           <w:szCs w:val="24"/>
         </w:rPr>
-        <w:t xml:space="preserve"> sugerir proactivamente soluciones existentes y desarrolladores calificados antes de permitir la apertura de un nuevo desafío.</w:t>
+        <w:t xml:space="preserve"> recomendar desarrolladores basados en su historial, industria y reputación técnica.</w:t>
       </w:r>
     </w:p>
     <w:p>
@@ -1409,14 +1833,14 @@
           <w:sz w:val="27"/>
           <w:szCs w:val="27"/>
         </w:rPr>
-        <w:t>1.7 Analítica y Monetización</w:t>
+        <w:t>1.7 Seguridad, Validación y Analítica</w:t>
       </w:r>
     </w:p>
     <w:p>
       <w:pPr>
         <w:numPr>
           <w:ilvl w:val="0"/>
-          <w:numId w:val="7"/>
+          <w:numId w:val="15"/>
         </w:numPr>
         <w:spacing w:before="100" w:beforeAutospacing="1" w:after="100" w:afterAutospacing="1" w:line="240" w:lineRule="auto"/>
         <w:rPr>
@@ -1433,7 +1857,7 @@
           <w:sz w:val="24"/>
           <w:szCs w:val="24"/>
         </w:rPr>
-        <w:t>RF-25:</w:t>
+        <w:t>RF-28:</w:t>
       </w:r>
       <w:r>
         <w:rPr>
@@ -1459,14 +1883,14 @@
           <w:sz w:val="24"/>
           <w:szCs w:val="24"/>
         </w:rPr>
-        <w:t xml:space="preserve"> presentar un dashboard de ROI que cuantifique el tiempo ahorrado y los costos reducidos por cada automatización implementada.</w:t>
+        <w:t xml:space="preserve"> ejecutar escaneos automáticos antivirus, de malware y de dependencias peligrosas en cada carga.</w:t>
       </w:r>
     </w:p>
     <w:p>
       <w:pPr>
         <w:numPr>
           <w:ilvl w:val="0"/>
-          <w:numId w:val="7"/>
+          <w:numId w:val="15"/>
         </w:numPr>
         <w:spacing w:before="100" w:beforeAutospacing="1" w:after="100" w:afterAutospacing="1" w:line="240" w:lineRule="auto"/>
         <w:rPr>
@@ -1483,7 +1907,7 @@
           <w:sz w:val="24"/>
           <w:szCs w:val="24"/>
         </w:rPr>
-        <w:t>RF-26:</w:t>
+        <w:t>RF-29:</w:t>
       </w:r>
       <w:r>
         <w:rPr>
@@ -1509,14 +1933,14 @@
           <w:sz w:val="24"/>
           <w:szCs w:val="24"/>
         </w:rPr>
-        <w:t xml:space="preserve"> deducir automáticamente la comisión de la plataforma en cada contrato, venta de licencia o pago de regalías.</w:t>
+        <w:t xml:space="preserve"> validar la integridad de los archivos y la autenticidad de los paquetes mediante hashes.</w:t>
       </w:r>
     </w:p>
     <w:p>
       <w:pPr>
         <w:numPr>
           <w:ilvl w:val="0"/>
-          <w:numId w:val="7"/>
+          <w:numId w:val="15"/>
         </w:numPr>
         <w:spacing w:before="100" w:beforeAutospacing="1" w:after="100" w:afterAutospacing="1" w:line="240" w:lineRule="auto"/>
         <w:rPr>
@@ -1533,7 +1957,7 @@
           <w:sz w:val="24"/>
           <w:szCs w:val="24"/>
         </w:rPr>
-        <w:t>RF-27:</w:t>
+        <w:t>RF-30:</w:t>
       </w:r>
       <w:r>
         <w:rPr>
@@ -1559,31 +1983,373 @@
           <w:sz w:val="24"/>
           <w:szCs w:val="24"/>
         </w:rPr>
-        <w:t xml:space="preserve"> permitir el pago por visibilidad premium para destacar desafíos urgentes o perfiles de desarrolladores.</w:t>
+        <w:t xml:space="preserve"> almacenar logs inmutables de actividad, pagos, ejecuciones y modificaciones de licencias.</w:t>
       </w:r>
     </w:p>
     <w:p>
       <w:pPr>
-        <w:spacing w:after="0" w:line="240" w:lineRule="auto"/>
-        <w:rPr>
-          <w:rFonts w:ascii="Times New Roman" w:eastAsia="Times New Roman" w:hAnsi="Times New Roman" w:cs="Times New Roman"/>
-          <w:sz w:val="24"/>
-          <w:szCs w:val="24"/>
-        </w:rPr>
-      </w:pPr>
-      <w:r>
-        <w:rPr>
-          <w:rFonts w:ascii="Times New Roman" w:eastAsia="Times New Roman" w:hAnsi="Times New Roman" w:cs="Times New Roman"/>
-          <w:sz w:val="24"/>
-          <w:szCs w:val="24"/>
-        </w:rPr>
-        <w:pict w14:anchorId="3675B249">
-          <v:rect id="_x0000_i1025" style="width:0;height:1.5pt" o:hralign="center" o:hrstd="t" o:hr="t" fillcolor="#a0a0a0" stroked="f"/>
-        </w:pict>
+        <w:numPr>
+          <w:ilvl w:val="0"/>
+          <w:numId w:val="15"/>
+        </w:numPr>
+        <w:spacing w:before="100" w:beforeAutospacing="1" w:after="100" w:afterAutospacing="1" w:line="240" w:lineRule="auto"/>
+        <w:rPr>
+          <w:rFonts w:ascii="Times New Roman" w:eastAsia="Times New Roman" w:hAnsi="Times New Roman" w:cs="Times New Roman"/>
+          <w:sz w:val="24"/>
+          <w:szCs w:val="24"/>
+        </w:rPr>
+      </w:pPr>
+      <w:r>
+        <w:rPr>
+          <w:rFonts w:ascii="Times New Roman" w:eastAsia="Times New Roman" w:hAnsi="Times New Roman" w:cs="Times New Roman"/>
+          <w:b/>
+          <w:bCs/>
+          <w:sz w:val="24"/>
+          <w:szCs w:val="24"/>
+        </w:rPr>
+        <w:lastRenderedPageBreak/>
+        <w:t>RF-31:</w:t>
+      </w:r>
+      <w:r>
+        <w:rPr>
+          <w:rFonts w:ascii="Times New Roman" w:eastAsia="Times New Roman" w:hAnsi="Times New Roman" w:cs="Times New Roman"/>
+          <w:sz w:val="24"/>
+          <w:szCs w:val="24"/>
+        </w:rPr>
+        <w:t xml:space="preserve"> El sistema </w:t>
+      </w:r>
+      <w:r>
+        <w:rPr>
+          <w:rFonts w:ascii="Times New Roman" w:eastAsia="Times New Roman" w:hAnsi="Times New Roman" w:cs="Times New Roman"/>
+          <w:b/>
+          <w:bCs/>
+          <w:sz w:val="24"/>
+          <w:szCs w:val="24"/>
+        </w:rPr>
+        <w:t>debe</w:t>
+      </w:r>
+      <w:r>
+        <w:rPr>
+          <w:rFonts w:ascii="Times New Roman" w:eastAsia="Times New Roman" w:hAnsi="Times New Roman" w:cs="Times New Roman"/>
+          <w:sz w:val="24"/>
+          <w:szCs w:val="24"/>
+        </w:rPr>
+        <w:t xml:space="preserve"> mostrar un </w:t>
+      </w:r>
+      <w:proofErr w:type="spellStart"/>
+      <w:r>
+        <w:rPr>
+          <w:rFonts w:ascii="Times New Roman" w:eastAsia="Times New Roman" w:hAnsi="Times New Roman" w:cs="Times New Roman"/>
+          <w:sz w:val="24"/>
+          <w:szCs w:val="24"/>
+        </w:rPr>
+        <w:t>Dashboard</w:t>
+      </w:r>
+      <w:proofErr w:type="spellEnd"/>
+      <w:r>
+        <w:rPr>
+          <w:rFonts w:ascii="Times New Roman" w:eastAsia="Times New Roman" w:hAnsi="Times New Roman" w:cs="Times New Roman"/>
+          <w:sz w:val="24"/>
+          <w:szCs w:val="24"/>
+        </w:rPr>
+        <w:t xml:space="preserve"> de ROI con métricas de tiempo ahorrado y costos reducidos.</w:t>
       </w:r>
     </w:p>
     <w:p>
       <w:pPr>
+        <w:numPr>
+          <w:ilvl w:val="0"/>
+          <w:numId w:val="15"/>
+        </w:numPr>
+        <w:spacing w:before="100" w:beforeAutospacing="1" w:after="100" w:afterAutospacing="1" w:line="240" w:lineRule="auto"/>
+        <w:rPr>
+          <w:rFonts w:ascii="Times New Roman" w:eastAsia="Times New Roman" w:hAnsi="Times New Roman" w:cs="Times New Roman"/>
+          <w:sz w:val="24"/>
+          <w:szCs w:val="24"/>
+        </w:rPr>
+      </w:pPr>
+      <w:r>
+        <w:rPr>
+          <w:rFonts w:ascii="Times New Roman" w:eastAsia="Times New Roman" w:hAnsi="Times New Roman" w:cs="Times New Roman"/>
+          <w:b/>
+          <w:bCs/>
+          <w:sz w:val="24"/>
+          <w:szCs w:val="24"/>
+        </w:rPr>
+        <w:t>RF-32:</w:t>
+      </w:r>
+      <w:r>
+        <w:rPr>
+          <w:rFonts w:ascii="Times New Roman" w:eastAsia="Times New Roman" w:hAnsi="Times New Roman" w:cs="Times New Roman"/>
+          <w:sz w:val="24"/>
+          <w:szCs w:val="24"/>
+        </w:rPr>
+        <w:t xml:space="preserve"> El sistema </w:t>
+      </w:r>
+      <w:r>
+        <w:rPr>
+          <w:rFonts w:ascii="Times New Roman" w:eastAsia="Times New Roman" w:hAnsi="Times New Roman" w:cs="Times New Roman"/>
+          <w:b/>
+          <w:bCs/>
+          <w:sz w:val="24"/>
+          <w:szCs w:val="24"/>
+        </w:rPr>
+        <w:t>debe</w:t>
+      </w:r>
+      <w:r>
+        <w:rPr>
+          <w:rFonts w:ascii="Times New Roman" w:eastAsia="Times New Roman" w:hAnsi="Times New Roman" w:cs="Times New Roman"/>
+          <w:sz w:val="24"/>
+          <w:szCs w:val="24"/>
+        </w:rPr>
+        <w:t xml:space="preserve"> monitorear la estabilidad, errores y frecuencia de uso de las soluciones publicadas.</w:t>
+      </w:r>
+    </w:p>
+    <w:p>
+      <w:pPr>
+        <w:numPr>
+          <w:ilvl w:val="0"/>
+          <w:numId w:val="15"/>
+        </w:numPr>
+        <w:spacing w:before="100" w:beforeAutospacing="1" w:after="100" w:afterAutospacing="1" w:line="240" w:lineRule="auto"/>
+        <w:rPr>
+          <w:rFonts w:ascii="Times New Roman" w:eastAsia="Times New Roman" w:hAnsi="Times New Roman" w:cs="Times New Roman"/>
+          <w:sz w:val="24"/>
+          <w:szCs w:val="24"/>
+        </w:rPr>
+      </w:pPr>
+      <w:r>
+        <w:rPr>
+          <w:rFonts w:ascii="Times New Roman" w:eastAsia="Times New Roman" w:hAnsi="Times New Roman" w:cs="Times New Roman"/>
+          <w:b/>
+          <w:bCs/>
+          <w:sz w:val="24"/>
+          <w:szCs w:val="24"/>
+        </w:rPr>
+        <w:t>RF-33:</w:t>
+      </w:r>
+      <w:r>
+        <w:rPr>
+          <w:rFonts w:ascii="Times New Roman" w:eastAsia="Times New Roman" w:hAnsi="Times New Roman" w:cs="Times New Roman"/>
+          <w:sz w:val="24"/>
+          <w:szCs w:val="24"/>
+        </w:rPr>
+        <w:t xml:space="preserve"> El sistema </w:t>
+      </w:r>
+      <w:r>
+        <w:rPr>
+          <w:rFonts w:ascii="Times New Roman" w:eastAsia="Times New Roman" w:hAnsi="Times New Roman" w:cs="Times New Roman"/>
+          <w:b/>
+          <w:bCs/>
+          <w:sz w:val="24"/>
+          <w:szCs w:val="24"/>
+        </w:rPr>
+        <w:t>debe</w:t>
+      </w:r>
+      <w:r>
+        <w:rPr>
+          <w:rFonts w:ascii="Times New Roman" w:eastAsia="Times New Roman" w:hAnsi="Times New Roman" w:cs="Times New Roman"/>
+          <w:sz w:val="24"/>
+          <w:szCs w:val="24"/>
+        </w:rPr>
+        <w:t xml:space="preserve"> permitir la generación de reportes empresariales descargables con estadísticas históricas.</w:t>
+      </w:r>
+    </w:p>
+    <w:p>
+      <w:pPr>
+        <w:spacing w:before="100" w:beforeAutospacing="1" w:after="100" w:afterAutospacing="1" w:line="240" w:lineRule="auto"/>
+        <w:outlineLvl w:val="2"/>
+        <w:rPr>
+          <w:rFonts w:ascii="Times New Roman" w:eastAsia="Times New Roman" w:hAnsi="Times New Roman" w:cs="Times New Roman"/>
+          <w:b/>
+          <w:bCs/>
+          <w:sz w:val="27"/>
+          <w:szCs w:val="27"/>
+        </w:rPr>
+      </w:pPr>
+      <w:r>
+        <w:rPr>
+          <w:rFonts w:ascii="Times New Roman" w:eastAsia="Times New Roman" w:hAnsi="Times New Roman" w:cs="Times New Roman"/>
+          <w:b/>
+          <w:bCs/>
+          <w:sz w:val="27"/>
+          <w:szCs w:val="27"/>
+        </w:rPr>
+        <w:t>1.8 Monetización y Marketplace</w:t>
+      </w:r>
+    </w:p>
+    <w:p>
+      <w:pPr>
+        <w:numPr>
+          <w:ilvl w:val="0"/>
+          <w:numId w:val="16"/>
+        </w:numPr>
+        <w:spacing w:before="100" w:beforeAutospacing="1" w:after="100" w:afterAutospacing="1" w:line="240" w:lineRule="auto"/>
+        <w:rPr>
+          <w:rFonts w:ascii="Times New Roman" w:eastAsia="Times New Roman" w:hAnsi="Times New Roman" w:cs="Times New Roman"/>
+          <w:sz w:val="24"/>
+          <w:szCs w:val="24"/>
+        </w:rPr>
+      </w:pPr>
+      <w:r>
+        <w:rPr>
+          <w:rFonts w:ascii="Times New Roman" w:eastAsia="Times New Roman" w:hAnsi="Times New Roman" w:cs="Times New Roman"/>
+          <w:b/>
+          <w:bCs/>
+          <w:sz w:val="24"/>
+          <w:szCs w:val="24"/>
+        </w:rPr>
+        <w:t>RF-34:</w:t>
+      </w:r>
+      <w:r>
+        <w:rPr>
+          <w:rFonts w:ascii="Times New Roman" w:eastAsia="Times New Roman" w:hAnsi="Times New Roman" w:cs="Times New Roman"/>
+          <w:sz w:val="24"/>
+          <w:szCs w:val="24"/>
+        </w:rPr>
+        <w:t xml:space="preserve"> El sistema </w:t>
+      </w:r>
+      <w:r>
+        <w:rPr>
+          <w:rFonts w:ascii="Times New Roman" w:eastAsia="Times New Roman" w:hAnsi="Times New Roman" w:cs="Times New Roman"/>
+          <w:b/>
+          <w:bCs/>
+          <w:sz w:val="24"/>
+          <w:szCs w:val="24"/>
+        </w:rPr>
+        <w:t>debe</w:t>
+      </w:r>
+      <w:r>
+        <w:rPr>
+          <w:rFonts w:ascii="Times New Roman" w:eastAsia="Times New Roman" w:hAnsi="Times New Roman" w:cs="Times New Roman"/>
+          <w:sz w:val="24"/>
+          <w:szCs w:val="24"/>
+        </w:rPr>
+        <w:t xml:space="preserve"> calcular y deducir automáticamente la comisión de la plataforma en cada transacción.</w:t>
+      </w:r>
+    </w:p>
+    <w:p>
+      <w:pPr>
+        <w:numPr>
+          <w:ilvl w:val="0"/>
+          <w:numId w:val="16"/>
+        </w:numPr>
+        <w:spacing w:before="100" w:beforeAutospacing="1" w:after="100" w:afterAutospacing="1" w:line="240" w:lineRule="auto"/>
+        <w:rPr>
+          <w:rFonts w:ascii="Times New Roman" w:eastAsia="Times New Roman" w:hAnsi="Times New Roman" w:cs="Times New Roman"/>
+          <w:sz w:val="24"/>
+          <w:szCs w:val="24"/>
+        </w:rPr>
+      </w:pPr>
+      <w:r>
+        <w:rPr>
+          <w:rFonts w:ascii="Times New Roman" w:eastAsia="Times New Roman" w:hAnsi="Times New Roman" w:cs="Times New Roman"/>
+          <w:b/>
+          <w:bCs/>
+          <w:sz w:val="24"/>
+          <w:szCs w:val="24"/>
+        </w:rPr>
+        <w:t>RF-35:</w:t>
+      </w:r>
+      <w:r>
+        <w:rPr>
+          <w:rFonts w:ascii="Times New Roman" w:eastAsia="Times New Roman" w:hAnsi="Times New Roman" w:cs="Times New Roman"/>
+          <w:sz w:val="24"/>
+          <w:szCs w:val="24"/>
+        </w:rPr>
+        <w:t xml:space="preserve"> El sistema </w:t>
+      </w:r>
+      <w:r>
+        <w:rPr>
+          <w:rFonts w:ascii="Times New Roman" w:eastAsia="Times New Roman" w:hAnsi="Times New Roman" w:cs="Times New Roman"/>
+          <w:b/>
+          <w:bCs/>
+          <w:sz w:val="24"/>
+          <w:szCs w:val="24"/>
+        </w:rPr>
+        <w:t>debe</w:t>
+      </w:r>
+      <w:r>
+        <w:rPr>
+          <w:rFonts w:ascii="Times New Roman" w:eastAsia="Times New Roman" w:hAnsi="Times New Roman" w:cs="Times New Roman"/>
+          <w:sz w:val="24"/>
+          <w:szCs w:val="24"/>
+        </w:rPr>
+        <w:t xml:space="preserve"> permitir la promoción premium de desafíos, soluciones y perfiles de desarrolladores.</w:t>
+      </w:r>
+    </w:p>
+    <w:p>
+      <w:pPr>
+        <w:numPr>
+          <w:ilvl w:val="0"/>
+          <w:numId w:val="16"/>
+        </w:numPr>
+        <w:spacing w:before="100" w:beforeAutospacing="1" w:after="100" w:afterAutospacing="1" w:line="240" w:lineRule="auto"/>
+        <w:rPr>
+          <w:rFonts w:ascii="Times New Roman" w:eastAsia="Times New Roman" w:hAnsi="Times New Roman" w:cs="Times New Roman"/>
+          <w:sz w:val="24"/>
+          <w:szCs w:val="24"/>
+        </w:rPr>
+      </w:pPr>
+      <w:r>
+        <w:rPr>
+          <w:rFonts w:ascii="Times New Roman" w:eastAsia="Times New Roman" w:hAnsi="Times New Roman" w:cs="Times New Roman"/>
+          <w:b/>
+          <w:bCs/>
+          <w:sz w:val="24"/>
+          <w:szCs w:val="24"/>
+        </w:rPr>
+        <w:t>RF-36:</w:t>
+      </w:r>
+      <w:r>
+        <w:rPr>
+          <w:rFonts w:ascii="Times New Roman" w:eastAsia="Times New Roman" w:hAnsi="Times New Roman" w:cs="Times New Roman"/>
+          <w:sz w:val="24"/>
+          <w:szCs w:val="24"/>
+        </w:rPr>
+        <w:t xml:space="preserve"> El sistema </w:t>
+      </w:r>
+      <w:r>
+        <w:rPr>
+          <w:rFonts w:ascii="Times New Roman" w:eastAsia="Times New Roman" w:hAnsi="Times New Roman" w:cs="Times New Roman"/>
+          <w:b/>
+          <w:bCs/>
+          <w:sz w:val="24"/>
+          <w:szCs w:val="24"/>
+        </w:rPr>
+        <w:t>debe</w:t>
+      </w:r>
+      <w:r>
+        <w:rPr>
+          <w:rFonts w:ascii="Times New Roman" w:eastAsia="Times New Roman" w:hAnsi="Times New Roman" w:cs="Times New Roman"/>
+          <w:sz w:val="24"/>
+          <w:szCs w:val="24"/>
+        </w:rPr>
+        <w:t xml:space="preserve"> ofrecer planes de suscripción empresarial basados en consumo de recursos y usuarios concurrentes.</w:t>
+      </w:r>
+    </w:p>
+    <w:p>
+      <w:pPr>
+        <w:spacing w:after="0" w:line="240" w:lineRule="auto"/>
+        <w:rPr>
+          <w:rFonts w:ascii="Times New Roman" w:eastAsia="Times New Roman" w:hAnsi="Times New Roman" w:cs="Times New Roman"/>
+          <w:sz w:val="24"/>
+          <w:szCs w:val="24"/>
+        </w:rPr>
+      </w:pPr>
+      <w:r>
+        <w:rPr>
+          <w:rFonts w:ascii="Times New Roman" w:eastAsia="Times New Roman" w:hAnsi="Times New Roman" w:cs="Times New Roman"/>
+          <w:sz w:val="24"/>
+          <w:szCs w:val="24"/>
+        </w:rPr>
+        <w:pict w14:anchorId="17017CFE">
+          <v:rect id="_x0000_i1028" style="width:0;height:1.5pt" o:hralign="center" o:hrstd="t" o:hr="t" fillcolor="#a0a0a0" stroked="f"/>
+        </w:pict>
+      </w:r>
+    </w:p>
+    <w:p>
+      <w:pPr>
         <w:spacing w:before="100" w:beforeAutospacing="1" w:after="100" w:afterAutospacing="1" w:line="240" w:lineRule="auto"/>
         <w:outlineLvl w:val="1"/>
         <w:rPr>
@@ -1609,7 +2375,7 @@
       <w:pPr>
         <w:numPr>
           <w:ilvl w:val="0"/>
-          <w:numId w:val="8"/>
+          <w:numId w:val="17"/>
         </w:numPr>
         <w:spacing w:before="100" w:beforeAutospacing="1" w:after="100" w:afterAutospacing="1" w:line="240" w:lineRule="auto"/>
         <w:rPr>
@@ -1626,41 +2392,40 @@
           <w:sz w:val="24"/>
           <w:szCs w:val="24"/>
         </w:rPr>
-        <w:lastRenderedPageBreak/>
-        <w:t>RNF-01 (Seguridad):</w:t>
-      </w:r>
-      <w:r>
-        <w:rPr>
-          <w:rFonts w:ascii="Times New Roman" w:eastAsia="Times New Roman" w:hAnsi="Times New Roman" w:cs="Times New Roman"/>
-          <w:sz w:val="24"/>
-          <w:szCs w:val="24"/>
-        </w:rPr>
-        <w:t xml:space="preserve"> El sistema </w:t>
-      </w:r>
-      <w:r>
-        <w:rPr>
-          <w:rFonts w:ascii="Times New Roman" w:eastAsia="Times New Roman" w:hAnsi="Times New Roman" w:cs="Times New Roman"/>
-          <w:b/>
-          <w:bCs/>
-          <w:sz w:val="24"/>
-          <w:szCs w:val="24"/>
-        </w:rPr>
-        <w:t>debe</w:t>
-      </w:r>
-      <w:r>
-        <w:rPr>
-          <w:rFonts w:ascii="Times New Roman" w:eastAsia="Times New Roman" w:hAnsi="Times New Roman" w:cs="Times New Roman"/>
-          <w:sz w:val="24"/>
-          <w:szCs w:val="24"/>
-        </w:rPr>
-        <w:t xml:space="preserve"> cifrar la totalidad de los datos en tránsito y en reposo mediante protocolos HTTPS/TLS y algoritmos de cifrado de grado militar.</w:t>
+        <w:t>RNF-01:</w:t>
+      </w:r>
+      <w:r>
+        <w:rPr>
+          <w:rFonts w:ascii="Times New Roman" w:eastAsia="Times New Roman" w:hAnsi="Times New Roman" w:cs="Times New Roman"/>
+          <w:sz w:val="24"/>
+          <w:szCs w:val="24"/>
+        </w:rPr>
+        <w:t xml:space="preserve"> Las comunicaciones </w:t>
+      </w:r>
+      <w:r>
+        <w:rPr>
+          <w:rFonts w:ascii="Times New Roman" w:eastAsia="Times New Roman" w:hAnsi="Times New Roman" w:cs="Times New Roman"/>
+          <w:b/>
+          <w:bCs/>
+          <w:sz w:val="24"/>
+          <w:szCs w:val="24"/>
+        </w:rPr>
+        <w:t>deben</w:t>
+      </w:r>
+      <w:r>
+        <w:rPr>
+          <w:rFonts w:ascii="Times New Roman" w:eastAsia="Times New Roman" w:hAnsi="Times New Roman" w:cs="Times New Roman"/>
+          <w:sz w:val="24"/>
+          <w:szCs w:val="24"/>
+        </w:rPr>
+        <w:t xml:space="preserve"> estar cifradas bajo el protocolo HTTPS/TLS 1.3.</w:t>
       </w:r>
     </w:p>
     <w:p>
       <w:pPr>
         <w:numPr>
           <w:ilvl w:val="0"/>
-          <w:numId w:val="8"/>
+          <w:numId w:val="17"/>
         </w:numPr>
         <w:spacing w:before="100" w:beforeAutospacing="1" w:after="100" w:afterAutospacing="1" w:line="240" w:lineRule="auto"/>
         <w:rPr>
@@ -1677,7 +2442,7 @@
           <w:sz w:val="24"/>
           <w:szCs w:val="24"/>
         </w:rPr>
-        <w:t>RNF-02 (Aislamiento):</w:t>
+        <w:t>RNF-02:</w:t>
       </w:r>
       <w:r>
         <w:rPr>
@@ -1703,14 +2468,32 @@
           <w:sz w:val="24"/>
           <w:szCs w:val="24"/>
         </w:rPr>
-        <w:t xml:space="preserve"> ejecutar las aplicaciones en contenedores aislados (Sandboxes) para prevenir cualquier interferencia entre entornos de distintos clientes.</w:t>
+        <w:t xml:space="preserve"> implementar protecciones contra SQL </w:t>
+      </w:r>
+      <w:proofErr w:type="spellStart"/>
+      <w:r>
+        <w:rPr>
+          <w:rFonts w:ascii="Times New Roman" w:eastAsia="Times New Roman" w:hAnsi="Times New Roman" w:cs="Times New Roman"/>
+          <w:sz w:val="24"/>
+          <w:szCs w:val="24"/>
+        </w:rPr>
+        <w:t>Injection</w:t>
+      </w:r>
+      <w:proofErr w:type="spellEnd"/>
+      <w:r>
+        <w:rPr>
+          <w:rFonts w:ascii="Times New Roman" w:eastAsia="Times New Roman" w:hAnsi="Times New Roman" w:cs="Times New Roman"/>
+          <w:sz w:val="24"/>
+          <w:szCs w:val="24"/>
+        </w:rPr>
+        <w:t>, XSS, CSRF y ejecución remota.</w:t>
       </w:r>
     </w:p>
     <w:p>
       <w:pPr>
         <w:numPr>
           <w:ilvl w:val="0"/>
-          <w:numId w:val="8"/>
+          <w:numId w:val="17"/>
         </w:numPr>
         <w:spacing w:before="100" w:beforeAutospacing="1" w:after="100" w:afterAutospacing="1" w:line="240" w:lineRule="auto"/>
         <w:rPr>
@@ -1727,40 +2510,58 @@
           <w:sz w:val="24"/>
           <w:szCs w:val="24"/>
         </w:rPr>
-        <w:t>RNF-03 (Escalabilidad):</w:t>
-      </w:r>
-      <w:r>
-        <w:rPr>
-          <w:rFonts w:ascii="Times New Roman" w:eastAsia="Times New Roman" w:hAnsi="Times New Roman" w:cs="Times New Roman"/>
-          <w:sz w:val="24"/>
-          <w:szCs w:val="24"/>
-        </w:rPr>
-        <w:t xml:space="preserve"> La arquitectura </w:t>
-      </w:r>
-      <w:r>
-        <w:rPr>
-          <w:rFonts w:ascii="Times New Roman" w:eastAsia="Times New Roman" w:hAnsi="Times New Roman" w:cs="Times New Roman"/>
-          <w:b/>
-          <w:bCs/>
-          <w:sz w:val="24"/>
-          <w:szCs w:val="24"/>
-        </w:rPr>
-        <w:t>debe</w:t>
-      </w:r>
-      <w:r>
-        <w:rPr>
-          <w:rFonts w:ascii="Times New Roman" w:eastAsia="Times New Roman" w:hAnsi="Times New Roman" w:cs="Times New Roman"/>
-          <w:sz w:val="24"/>
-          <w:szCs w:val="24"/>
-        </w:rPr>
-        <w:t xml:space="preserve"> permitir el escalamiento horizontal automático para gestionar incrementos en la carga de ejecución cloud.</w:t>
+        <w:t>RNF-03:</w:t>
+      </w:r>
+      <w:r>
+        <w:rPr>
+          <w:rFonts w:ascii="Times New Roman" w:eastAsia="Times New Roman" w:hAnsi="Times New Roman" w:cs="Times New Roman"/>
+          <w:sz w:val="24"/>
+          <w:szCs w:val="24"/>
+        </w:rPr>
+        <w:t xml:space="preserve"> Las aplicaciones en la nube </w:t>
+      </w:r>
+      <w:r>
+        <w:rPr>
+          <w:rFonts w:ascii="Times New Roman" w:eastAsia="Times New Roman" w:hAnsi="Times New Roman" w:cs="Times New Roman"/>
+          <w:b/>
+          <w:bCs/>
+          <w:sz w:val="24"/>
+          <w:szCs w:val="24"/>
+        </w:rPr>
+        <w:t>deben</w:t>
+      </w:r>
+      <w:r>
+        <w:rPr>
+          <w:rFonts w:ascii="Times New Roman" w:eastAsia="Times New Roman" w:hAnsi="Times New Roman" w:cs="Times New Roman"/>
+          <w:sz w:val="24"/>
+          <w:szCs w:val="24"/>
+        </w:rPr>
+        <w:t xml:space="preserve"> operar estrictamente dentro de contenedores o </w:t>
+      </w:r>
+      <w:proofErr w:type="spellStart"/>
+      <w:r>
+        <w:rPr>
+          <w:rFonts w:ascii="Times New Roman" w:eastAsia="Times New Roman" w:hAnsi="Times New Roman" w:cs="Times New Roman"/>
+          <w:sz w:val="24"/>
+          <w:szCs w:val="24"/>
+        </w:rPr>
+        <w:t>sandboxes</w:t>
+      </w:r>
+      <w:proofErr w:type="spellEnd"/>
+      <w:r>
+        <w:rPr>
+          <w:rFonts w:ascii="Times New Roman" w:eastAsia="Times New Roman" w:hAnsi="Times New Roman" w:cs="Times New Roman"/>
+          <w:sz w:val="24"/>
+          <w:szCs w:val="24"/>
+        </w:rPr>
+        <w:t xml:space="preserve"> aislados.</w:t>
       </w:r>
     </w:p>
     <w:p>
       <w:pPr>
         <w:numPr>
           <w:ilvl w:val="0"/>
-          <w:numId w:val="8"/>
+          <w:numId w:val="17"/>
         </w:numPr>
         <w:spacing w:before="100" w:beforeAutospacing="1" w:after="100" w:afterAutospacing="1" w:line="240" w:lineRule="auto"/>
         <w:rPr>
@@ -1777,15 +2578,15 @@
           <w:sz w:val="24"/>
           <w:szCs w:val="24"/>
         </w:rPr>
-        <w:t>RNF-04 (Disponibilidad):</w:t>
-      </w:r>
-      <w:r>
-        <w:rPr>
-          <w:rFonts w:ascii="Times New Roman" w:eastAsia="Times New Roman" w:hAnsi="Times New Roman" w:cs="Times New Roman"/>
-          <w:sz w:val="24"/>
-          <w:szCs w:val="24"/>
-        </w:rPr>
-        <w:t xml:space="preserve"> El sistema </w:t>
+        <w:t>RNF-04:</w:t>
+      </w:r>
+      <w:r>
+        <w:rPr>
+          <w:rFonts w:ascii="Times New Roman" w:eastAsia="Times New Roman" w:hAnsi="Times New Roman" w:cs="Times New Roman"/>
+          <w:sz w:val="24"/>
+          <w:szCs w:val="24"/>
+        </w:rPr>
+        <w:t xml:space="preserve"> El almacenamiento de credenciales </w:t>
       </w:r>
       <w:r>
         <w:rPr>
@@ -1803,14 +2604,32 @@
           <w:sz w:val="24"/>
           <w:szCs w:val="24"/>
         </w:rPr>
-        <w:t xml:space="preserve"> garantizar una tasa de disponibilidad del marketplace y entorno de ejecución del 99.9%.</w:t>
+        <w:t xml:space="preserve"> utilizar algoritmos de </w:t>
+      </w:r>
+      <w:proofErr w:type="spellStart"/>
+      <w:r>
+        <w:rPr>
+          <w:rFonts w:ascii="Times New Roman" w:eastAsia="Times New Roman" w:hAnsi="Times New Roman" w:cs="Times New Roman"/>
+          <w:sz w:val="24"/>
+          <w:szCs w:val="24"/>
+        </w:rPr>
+        <w:t>hashing</w:t>
+      </w:r>
+      <w:proofErr w:type="spellEnd"/>
+      <w:r>
+        <w:rPr>
+          <w:rFonts w:ascii="Times New Roman" w:eastAsia="Times New Roman" w:hAnsi="Times New Roman" w:cs="Times New Roman"/>
+          <w:sz w:val="24"/>
+          <w:szCs w:val="24"/>
+        </w:rPr>
+        <w:t xml:space="preserve"> seguro y rotación de claves.</w:t>
       </w:r>
     </w:p>
     <w:p>
       <w:pPr>
         <w:numPr>
           <w:ilvl w:val="0"/>
-          <w:numId w:val="8"/>
+          <w:numId w:val="17"/>
         </w:numPr>
         <w:spacing w:before="100" w:beforeAutospacing="1" w:after="100" w:afterAutospacing="1" w:line="240" w:lineRule="auto"/>
         <w:rPr>
@@ -1827,40 +2646,40 @@
           <w:sz w:val="24"/>
           <w:szCs w:val="24"/>
         </w:rPr>
-        <w:t>RNF-05 (Rendimiento):</w:t>
-      </w:r>
-      <w:r>
-        <w:rPr>
-          <w:rFonts w:ascii="Times New Roman" w:eastAsia="Times New Roman" w:hAnsi="Times New Roman" w:cs="Times New Roman"/>
-          <w:sz w:val="24"/>
-          <w:szCs w:val="24"/>
-        </w:rPr>
-        <w:t xml:space="preserve"> El tiempo de respuesta de las consultas semánticas y la navegación principal </w:t>
-      </w:r>
-      <w:r>
-        <w:rPr>
-          <w:rFonts w:ascii="Times New Roman" w:eastAsia="Times New Roman" w:hAnsi="Times New Roman" w:cs="Times New Roman"/>
-          <w:b/>
-          <w:bCs/>
-          <w:sz w:val="24"/>
-          <w:szCs w:val="24"/>
-        </w:rPr>
-        <w:t>no debe</w:t>
-      </w:r>
-      <w:r>
-        <w:rPr>
-          <w:rFonts w:ascii="Times New Roman" w:eastAsia="Times New Roman" w:hAnsi="Times New Roman" w:cs="Times New Roman"/>
-          <w:sz w:val="24"/>
-          <w:szCs w:val="24"/>
-        </w:rPr>
-        <w:t xml:space="preserve"> exceder los 3 segundos.</w:t>
+        <w:t>RNF-05:</w:t>
+      </w:r>
+      <w:r>
+        <w:rPr>
+          <w:rFonts w:ascii="Times New Roman" w:eastAsia="Times New Roman" w:hAnsi="Times New Roman" w:cs="Times New Roman"/>
+          <w:sz w:val="24"/>
+          <w:szCs w:val="24"/>
+        </w:rPr>
+        <w:t xml:space="preserve"> La infraestructura </w:t>
+      </w:r>
+      <w:r>
+        <w:rPr>
+          <w:rFonts w:ascii="Times New Roman" w:eastAsia="Times New Roman" w:hAnsi="Times New Roman" w:cs="Times New Roman"/>
+          <w:b/>
+          <w:bCs/>
+          <w:sz w:val="24"/>
+          <w:szCs w:val="24"/>
+        </w:rPr>
+        <w:t>debe</w:t>
+      </w:r>
+      <w:r>
+        <w:rPr>
+          <w:rFonts w:ascii="Times New Roman" w:eastAsia="Times New Roman" w:hAnsi="Times New Roman" w:cs="Times New Roman"/>
+          <w:sz w:val="24"/>
+          <w:szCs w:val="24"/>
+        </w:rPr>
+        <w:t xml:space="preserve"> permitir escalabilidad horizontal mediante la adición de nodos de ejecución.</w:t>
       </w:r>
     </w:p>
     <w:p>
       <w:pPr>
         <w:numPr>
           <w:ilvl w:val="0"/>
-          <w:numId w:val="8"/>
+          <w:numId w:val="17"/>
         </w:numPr>
         <w:spacing w:before="100" w:beforeAutospacing="1" w:after="100" w:afterAutospacing="1" w:line="240" w:lineRule="auto"/>
         <w:rPr>
@@ -1877,15 +2696,33 @@
           <w:sz w:val="24"/>
           <w:szCs w:val="24"/>
         </w:rPr>
-        <w:t>RNF-06 (Mantenibilidad):</w:t>
-      </w:r>
-      <w:r>
-        <w:rPr>
-          <w:rFonts w:ascii="Times New Roman" w:eastAsia="Times New Roman" w:hAnsi="Times New Roman" w:cs="Times New Roman"/>
-          <w:sz w:val="24"/>
-          <w:szCs w:val="24"/>
-        </w:rPr>
-        <w:t xml:space="preserve"> El sistema </w:t>
+        <w:t>RNF-06:</w:t>
+      </w:r>
+      <w:r>
+        <w:rPr>
+          <w:rFonts w:ascii="Times New Roman" w:eastAsia="Times New Roman" w:hAnsi="Times New Roman" w:cs="Times New Roman"/>
+          <w:sz w:val="24"/>
+          <w:szCs w:val="24"/>
+        </w:rPr>
+        <w:t xml:space="preserve"> El </w:t>
+      </w:r>
+      <w:proofErr w:type="spellStart"/>
+      <w:r>
+        <w:rPr>
+          <w:rFonts w:ascii="Times New Roman" w:eastAsia="Times New Roman" w:hAnsi="Times New Roman" w:cs="Times New Roman"/>
+          <w:sz w:val="24"/>
+          <w:szCs w:val="24"/>
+        </w:rPr>
+        <w:t>marketplace</w:t>
+      </w:r>
+      <w:proofErr w:type="spellEnd"/>
+      <w:r>
+        <w:rPr>
+          <w:rFonts w:ascii="Times New Roman" w:eastAsia="Times New Roman" w:hAnsi="Times New Roman" w:cs="Times New Roman"/>
+          <w:sz w:val="24"/>
+          <w:szCs w:val="24"/>
+        </w:rPr>
+        <w:t xml:space="preserve"> </w:t>
       </w:r>
       <w:r>
         <w:rPr>
@@ -1903,14 +2740,32 @@
           <w:sz w:val="24"/>
           <w:szCs w:val="24"/>
         </w:rPr>
-        <w:t xml:space="preserve"> estructurarse bajo una arquitectura de microservicios con comunicación mediante APIs internas estandarizadas y documentadas.</w:t>
+        <w:t xml:space="preserve"> garantizar una disponibilidad mínima (</w:t>
+      </w:r>
+      <w:proofErr w:type="spellStart"/>
+      <w:r>
+        <w:rPr>
+          <w:rFonts w:ascii="Times New Roman" w:eastAsia="Times New Roman" w:hAnsi="Times New Roman" w:cs="Times New Roman"/>
+          <w:sz w:val="24"/>
+          <w:szCs w:val="24"/>
+        </w:rPr>
+        <w:t>uptime</w:t>
+      </w:r>
+      <w:proofErr w:type="spellEnd"/>
+      <w:r>
+        <w:rPr>
+          <w:rFonts w:ascii="Times New Roman" w:eastAsia="Times New Roman" w:hAnsi="Times New Roman" w:cs="Times New Roman"/>
+          <w:sz w:val="24"/>
+          <w:szCs w:val="24"/>
+        </w:rPr>
+        <w:t>) del 99%.</w:t>
       </w:r>
     </w:p>
     <w:p>
       <w:pPr>
         <w:numPr>
           <w:ilvl w:val="0"/>
-          <w:numId w:val="8"/>
+          <w:numId w:val="17"/>
         </w:numPr>
         <w:spacing w:before="100" w:beforeAutospacing="1" w:after="100" w:afterAutospacing="1" w:line="240" w:lineRule="auto"/>
         <w:rPr>
@@ -1927,7 +2782,7 @@
           <w:sz w:val="24"/>
           <w:szCs w:val="24"/>
         </w:rPr>
-        <w:t>RNF-07 (Resiliencia):</w:t>
+        <w:t>RNF-07:</w:t>
       </w:r>
       <w:r>
         <w:rPr>
@@ -1953,14 +2808,14 @@
           <w:sz w:val="24"/>
           <w:szCs w:val="24"/>
         </w:rPr>
-        <w:t xml:space="preserve"> ejecutar respaldos automáticos de bases de datos y activos digitales con una periodicidad mínima de 24 horas.</w:t>
+        <w:t xml:space="preserve"> implementar balanceo de carga para distribuir el tráfico entre servicios.</w:t>
       </w:r>
     </w:p>
     <w:p>
       <w:pPr>
         <w:numPr>
           <w:ilvl w:val="0"/>
-          <w:numId w:val="8"/>
+          <w:numId w:val="17"/>
         </w:numPr>
         <w:spacing w:before="100" w:beforeAutospacing="1" w:after="100" w:afterAutospacing="1" w:line="240" w:lineRule="auto"/>
         <w:rPr>
@@ -1977,7 +2832,261 @@
           <w:sz w:val="24"/>
           <w:szCs w:val="24"/>
         </w:rPr>
-        <w:t>RNF-08 (UX):</w:t>
+        <w:t>RNF-08:</w:t>
+      </w:r>
+      <w:r>
+        <w:rPr>
+          <w:rFonts w:ascii="Times New Roman" w:eastAsia="Times New Roman" w:hAnsi="Times New Roman" w:cs="Times New Roman"/>
+          <w:sz w:val="24"/>
+          <w:szCs w:val="24"/>
+        </w:rPr>
+        <w:t xml:space="preserve"> El tiempo de respuesta para navegación y búsquedas </w:t>
+      </w:r>
+      <w:r>
+        <w:rPr>
+          <w:rFonts w:ascii="Times New Roman" w:eastAsia="Times New Roman" w:hAnsi="Times New Roman" w:cs="Times New Roman"/>
+          <w:b/>
+          <w:bCs/>
+          <w:sz w:val="24"/>
+          <w:szCs w:val="24"/>
+        </w:rPr>
+        <w:t>no debe</w:t>
+      </w:r>
+      <w:r>
+        <w:rPr>
+          <w:rFonts w:ascii="Times New Roman" w:eastAsia="Times New Roman" w:hAnsi="Times New Roman" w:cs="Times New Roman"/>
+          <w:sz w:val="24"/>
+          <w:szCs w:val="24"/>
+        </w:rPr>
+        <w:t xml:space="preserve"> superar los 3 segundos.</w:t>
+      </w:r>
+    </w:p>
+    <w:p>
+      <w:pPr>
+        <w:numPr>
+          <w:ilvl w:val="0"/>
+          <w:numId w:val="17"/>
+        </w:numPr>
+        <w:spacing w:before="100" w:beforeAutospacing="1" w:after="100" w:afterAutospacing="1" w:line="240" w:lineRule="auto"/>
+        <w:rPr>
+          <w:rFonts w:ascii="Times New Roman" w:eastAsia="Times New Roman" w:hAnsi="Times New Roman" w:cs="Times New Roman"/>
+          <w:sz w:val="24"/>
+          <w:szCs w:val="24"/>
+        </w:rPr>
+      </w:pPr>
+      <w:r>
+        <w:rPr>
+          <w:rFonts w:ascii="Times New Roman" w:eastAsia="Times New Roman" w:hAnsi="Times New Roman" w:cs="Times New Roman"/>
+          <w:b/>
+          <w:bCs/>
+          <w:sz w:val="24"/>
+          <w:szCs w:val="24"/>
+        </w:rPr>
+        <w:t>RNF-09:</w:t>
+      </w:r>
+      <w:r>
+        <w:rPr>
+          <w:rFonts w:ascii="Times New Roman" w:eastAsia="Times New Roman" w:hAnsi="Times New Roman" w:cs="Times New Roman"/>
+          <w:sz w:val="24"/>
+          <w:szCs w:val="24"/>
+        </w:rPr>
+        <w:t xml:space="preserve"> El sistema </w:t>
+      </w:r>
+      <w:r>
+        <w:rPr>
+          <w:rFonts w:ascii="Times New Roman" w:eastAsia="Times New Roman" w:hAnsi="Times New Roman" w:cs="Times New Roman"/>
+          <w:b/>
+          <w:bCs/>
+          <w:sz w:val="24"/>
+          <w:szCs w:val="24"/>
+        </w:rPr>
+        <w:t>debe</w:t>
+      </w:r>
+      <w:r>
+        <w:rPr>
+          <w:rFonts w:ascii="Times New Roman" w:eastAsia="Times New Roman" w:hAnsi="Times New Roman" w:cs="Times New Roman"/>
+          <w:sz w:val="24"/>
+          <w:szCs w:val="24"/>
+        </w:rPr>
+        <w:t xml:space="preserve"> seguir una arquitectura modular que separe el Marketplace, </w:t>
+      </w:r>
+      <w:proofErr w:type="spellStart"/>
+      <w:r>
+        <w:rPr>
+          <w:rFonts w:ascii="Times New Roman" w:eastAsia="Times New Roman" w:hAnsi="Times New Roman" w:cs="Times New Roman"/>
+          <w:sz w:val="24"/>
+          <w:szCs w:val="24"/>
+        </w:rPr>
+        <w:t>Runtime</w:t>
+      </w:r>
+      <w:proofErr w:type="spellEnd"/>
+      <w:r>
+        <w:rPr>
+          <w:rFonts w:ascii="Times New Roman" w:eastAsia="Times New Roman" w:hAnsi="Times New Roman" w:cs="Times New Roman"/>
+          <w:sz w:val="24"/>
+          <w:szCs w:val="24"/>
+        </w:rPr>
+        <w:t xml:space="preserve"> y Pagos.</w:t>
+      </w:r>
+    </w:p>
+    <w:p>
+      <w:pPr>
+        <w:numPr>
+          <w:ilvl w:val="0"/>
+          <w:numId w:val="17"/>
+        </w:numPr>
+        <w:spacing w:before="100" w:beforeAutospacing="1" w:after="100" w:afterAutospacing="1" w:line="240" w:lineRule="auto"/>
+        <w:rPr>
+          <w:rFonts w:ascii="Times New Roman" w:eastAsia="Times New Roman" w:hAnsi="Times New Roman" w:cs="Times New Roman"/>
+          <w:sz w:val="24"/>
+          <w:szCs w:val="24"/>
+        </w:rPr>
+      </w:pPr>
+      <w:r>
+        <w:rPr>
+          <w:rFonts w:ascii="Times New Roman" w:eastAsia="Times New Roman" w:hAnsi="Times New Roman" w:cs="Times New Roman"/>
+          <w:b/>
+          <w:bCs/>
+          <w:sz w:val="24"/>
+          <w:szCs w:val="24"/>
+        </w:rPr>
+        <w:t>RNF-10:</w:t>
+      </w:r>
+      <w:r>
+        <w:rPr>
+          <w:rFonts w:ascii="Times New Roman" w:eastAsia="Times New Roman" w:hAnsi="Times New Roman" w:cs="Times New Roman"/>
+          <w:sz w:val="24"/>
+          <w:szCs w:val="24"/>
+        </w:rPr>
+        <w:t xml:space="preserve"> La comunicación entre módulos </w:t>
+      </w:r>
+      <w:r>
+        <w:rPr>
+          <w:rFonts w:ascii="Times New Roman" w:eastAsia="Times New Roman" w:hAnsi="Times New Roman" w:cs="Times New Roman"/>
+          <w:b/>
+          <w:bCs/>
+          <w:sz w:val="24"/>
+          <w:szCs w:val="24"/>
+        </w:rPr>
+        <w:t>debe</w:t>
+      </w:r>
+      <w:r>
+        <w:rPr>
+          <w:rFonts w:ascii="Times New Roman" w:eastAsia="Times New Roman" w:hAnsi="Times New Roman" w:cs="Times New Roman"/>
+          <w:sz w:val="24"/>
+          <w:szCs w:val="24"/>
+        </w:rPr>
+        <w:t xml:space="preserve"> realizarse a través de </w:t>
+      </w:r>
+      <w:proofErr w:type="spellStart"/>
+      <w:r>
+        <w:rPr>
+          <w:rFonts w:ascii="Times New Roman" w:eastAsia="Times New Roman" w:hAnsi="Times New Roman" w:cs="Times New Roman"/>
+          <w:sz w:val="24"/>
+          <w:szCs w:val="24"/>
+        </w:rPr>
+        <w:t>APIs</w:t>
+      </w:r>
+      <w:proofErr w:type="spellEnd"/>
+      <w:r>
+        <w:rPr>
+          <w:rFonts w:ascii="Times New Roman" w:eastAsia="Times New Roman" w:hAnsi="Times New Roman" w:cs="Times New Roman"/>
+          <w:sz w:val="24"/>
+          <w:szCs w:val="24"/>
+        </w:rPr>
+        <w:t xml:space="preserve"> internas estandarizadas.</w:t>
+      </w:r>
+    </w:p>
+    <w:p>
+      <w:pPr>
+        <w:numPr>
+          <w:ilvl w:val="0"/>
+          <w:numId w:val="17"/>
+        </w:numPr>
+        <w:spacing w:before="100" w:beforeAutospacing="1" w:after="100" w:afterAutospacing="1" w:line="240" w:lineRule="auto"/>
+        <w:rPr>
+          <w:rFonts w:ascii="Times New Roman" w:eastAsia="Times New Roman" w:hAnsi="Times New Roman" w:cs="Times New Roman"/>
+          <w:sz w:val="24"/>
+          <w:szCs w:val="24"/>
+        </w:rPr>
+      </w:pPr>
+      <w:r>
+        <w:rPr>
+          <w:rFonts w:ascii="Times New Roman" w:eastAsia="Times New Roman" w:hAnsi="Times New Roman" w:cs="Times New Roman"/>
+          <w:b/>
+          <w:bCs/>
+          <w:sz w:val="24"/>
+          <w:szCs w:val="24"/>
+        </w:rPr>
+        <w:t>RNF-11:</w:t>
+      </w:r>
+      <w:r>
+        <w:rPr>
+          <w:rFonts w:ascii="Times New Roman" w:eastAsia="Times New Roman" w:hAnsi="Times New Roman" w:cs="Times New Roman"/>
+          <w:sz w:val="24"/>
+          <w:szCs w:val="24"/>
+        </w:rPr>
+        <w:t xml:space="preserve"> El sistema </w:t>
+      </w:r>
+      <w:r>
+        <w:rPr>
+          <w:rFonts w:ascii="Times New Roman" w:eastAsia="Times New Roman" w:hAnsi="Times New Roman" w:cs="Times New Roman"/>
+          <w:b/>
+          <w:bCs/>
+          <w:sz w:val="24"/>
+          <w:szCs w:val="24"/>
+        </w:rPr>
+        <w:t>debe</w:t>
+      </w:r>
+      <w:r>
+        <w:rPr>
+          <w:rFonts w:ascii="Times New Roman" w:eastAsia="Times New Roman" w:hAnsi="Times New Roman" w:cs="Times New Roman"/>
+          <w:sz w:val="24"/>
+          <w:szCs w:val="24"/>
+        </w:rPr>
+        <w:t xml:space="preserve"> contar con herramientas de </w:t>
+      </w:r>
+      <w:proofErr w:type="spellStart"/>
+      <w:r>
+        <w:rPr>
+          <w:rFonts w:ascii="Times New Roman" w:eastAsia="Times New Roman" w:hAnsi="Times New Roman" w:cs="Times New Roman"/>
+          <w:sz w:val="24"/>
+          <w:szCs w:val="24"/>
+        </w:rPr>
+        <w:t>observabilidad</w:t>
+      </w:r>
+      <w:proofErr w:type="spellEnd"/>
+      <w:r>
+        <w:rPr>
+          <w:rFonts w:ascii="Times New Roman" w:eastAsia="Times New Roman" w:hAnsi="Times New Roman" w:cs="Times New Roman"/>
+          <w:sz w:val="24"/>
+          <w:szCs w:val="24"/>
+        </w:rPr>
+        <w:t xml:space="preserve"> para monitoreo y alertas en tiempo real.</w:t>
+      </w:r>
+    </w:p>
+    <w:p>
+      <w:pPr>
+        <w:numPr>
+          <w:ilvl w:val="0"/>
+          <w:numId w:val="17"/>
+        </w:numPr>
+        <w:spacing w:before="100" w:beforeAutospacing="1" w:after="100" w:afterAutospacing="1" w:line="240" w:lineRule="auto"/>
+        <w:rPr>
+          <w:rFonts w:ascii="Times New Roman" w:eastAsia="Times New Roman" w:hAnsi="Times New Roman" w:cs="Times New Roman"/>
+          <w:sz w:val="24"/>
+          <w:szCs w:val="24"/>
+        </w:rPr>
+      </w:pPr>
+      <w:r>
+        <w:rPr>
+          <w:rFonts w:ascii="Times New Roman" w:eastAsia="Times New Roman" w:hAnsi="Times New Roman" w:cs="Times New Roman"/>
+          <w:b/>
+          <w:bCs/>
+          <w:sz w:val="24"/>
+          <w:szCs w:val="24"/>
+        </w:rPr>
+        <w:t>RNF-12:</w:t>
       </w:r>
       <w:r>
         <w:rPr>
@@ -2003,7 +3112,226 @@
           <w:sz w:val="24"/>
           <w:szCs w:val="24"/>
         </w:rPr>
-        <w:t xml:space="preserve"> ser responsiva y garantizar la compatibilidad con los motores de navegación Chrome, Firefox, Edge y Safari.</w:t>
+        <w:t xml:space="preserve"> ser responsiva (Desktop, Tablet, Móvil).</w:t>
+      </w:r>
+    </w:p>
+    <w:p>
+      <w:pPr>
+        <w:numPr>
+          <w:ilvl w:val="0"/>
+          <w:numId w:val="17"/>
+        </w:numPr>
+        <w:spacing w:before="100" w:beforeAutospacing="1" w:after="100" w:afterAutospacing="1" w:line="240" w:lineRule="auto"/>
+        <w:rPr>
+          <w:rFonts w:ascii="Times New Roman" w:eastAsia="Times New Roman" w:hAnsi="Times New Roman" w:cs="Times New Roman"/>
+          <w:sz w:val="24"/>
+          <w:szCs w:val="24"/>
+        </w:rPr>
+      </w:pPr>
+      <w:r>
+        <w:rPr>
+          <w:rFonts w:ascii="Times New Roman" w:eastAsia="Times New Roman" w:hAnsi="Times New Roman" w:cs="Times New Roman"/>
+          <w:b/>
+          <w:bCs/>
+          <w:sz w:val="24"/>
+          <w:szCs w:val="24"/>
+        </w:rPr>
+        <w:t>RNF-13:</w:t>
+      </w:r>
+      <w:r>
+        <w:rPr>
+          <w:rFonts w:ascii="Times New Roman" w:eastAsia="Times New Roman" w:hAnsi="Times New Roman" w:cs="Times New Roman"/>
+          <w:sz w:val="24"/>
+          <w:szCs w:val="24"/>
+        </w:rPr>
+        <w:t xml:space="preserve"> El sistema </w:t>
+      </w:r>
+      <w:r>
+        <w:rPr>
+          <w:rFonts w:ascii="Times New Roman" w:eastAsia="Times New Roman" w:hAnsi="Times New Roman" w:cs="Times New Roman"/>
+          <w:b/>
+          <w:bCs/>
+          <w:sz w:val="24"/>
+          <w:szCs w:val="24"/>
+        </w:rPr>
+        <w:t>debe</w:t>
+      </w:r>
+      <w:r>
+        <w:rPr>
+          <w:rFonts w:ascii="Times New Roman" w:eastAsia="Times New Roman" w:hAnsi="Times New Roman" w:cs="Times New Roman"/>
+          <w:sz w:val="24"/>
+          <w:szCs w:val="24"/>
+        </w:rPr>
+        <w:t xml:space="preserve"> ser compatible con Chrome, Firefox, Edge y Safari.</w:t>
+      </w:r>
+    </w:p>
+    <w:p>
+      <w:pPr>
+        <w:numPr>
+          <w:ilvl w:val="0"/>
+          <w:numId w:val="17"/>
+        </w:numPr>
+        <w:spacing w:before="100" w:beforeAutospacing="1" w:after="100" w:afterAutospacing="1" w:line="240" w:lineRule="auto"/>
+        <w:rPr>
+          <w:rFonts w:ascii="Times New Roman" w:eastAsia="Times New Roman" w:hAnsi="Times New Roman" w:cs="Times New Roman"/>
+          <w:sz w:val="24"/>
+          <w:szCs w:val="24"/>
+        </w:rPr>
+      </w:pPr>
+      <w:r>
+        <w:rPr>
+          <w:rFonts w:ascii="Times New Roman" w:eastAsia="Times New Roman" w:hAnsi="Times New Roman" w:cs="Times New Roman"/>
+          <w:b/>
+          <w:bCs/>
+          <w:sz w:val="24"/>
+          <w:szCs w:val="24"/>
+        </w:rPr>
+        <w:t>RNF-14:</w:t>
+      </w:r>
+      <w:r>
+        <w:rPr>
+          <w:rFonts w:ascii="Times New Roman" w:eastAsia="Times New Roman" w:hAnsi="Times New Roman" w:cs="Times New Roman"/>
+          <w:sz w:val="24"/>
+          <w:szCs w:val="24"/>
+        </w:rPr>
+        <w:t xml:space="preserve"> La interfaz </w:t>
+      </w:r>
+      <w:r>
+        <w:rPr>
+          <w:rFonts w:ascii="Times New Roman" w:eastAsia="Times New Roman" w:hAnsi="Times New Roman" w:cs="Times New Roman"/>
+          <w:b/>
+          <w:bCs/>
+          <w:sz w:val="24"/>
+          <w:szCs w:val="24"/>
+        </w:rPr>
+        <w:t>debe</w:t>
+      </w:r>
+      <w:r>
+        <w:rPr>
+          <w:rFonts w:ascii="Times New Roman" w:eastAsia="Times New Roman" w:hAnsi="Times New Roman" w:cs="Times New Roman"/>
+          <w:sz w:val="24"/>
+          <w:szCs w:val="24"/>
+        </w:rPr>
+        <w:t xml:space="preserve"> cumplir con estándares básicos de accesibilidad (WCAG).</w:t>
+      </w:r>
+    </w:p>
+    <w:p>
+      <w:pPr>
+        <w:numPr>
+          <w:ilvl w:val="0"/>
+          <w:numId w:val="17"/>
+        </w:numPr>
+        <w:spacing w:before="100" w:beforeAutospacing="1" w:after="100" w:afterAutospacing="1" w:line="240" w:lineRule="auto"/>
+        <w:rPr>
+          <w:rFonts w:ascii="Times New Roman" w:eastAsia="Times New Roman" w:hAnsi="Times New Roman" w:cs="Times New Roman"/>
+          <w:sz w:val="24"/>
+          <w:szCs w:val="24"/>
+        </w:rPr>
+      </w:pPr>
+      <w:r>
+        <w:rPr>
+          <w:rFonts w:ascii="Times New Roman" w:eastAsia="Times New Roman" w:hAnsi="Times New Roman" w:cs="Times New Roman"/>
+          <w:b/>
+          <w:bCs/>
+          <w:sz w:val="24"/>
+          <w:szCs w:val="24"/>
+        </w:rPr>
+        <w:lastRenderedPageBreak/>
+        <w:t>RNF-15:</w:t>
+      </w:r>
+      <w:r>
+        <w:rPr>
+          <w:rFonts w:ascii="Times New Roman" w:eastAsia="Times New Roman" w:hAnsi="Times New Roman" w:cs="Times New Roman"/>
+          <w:sz w:val="24"/>
+          <w:szCs w:val="24"/>
+        </w:rPr>
+        <w:t xml:space="preserve"> El sistema </w:t>
+      </w:r>
+      <w:r>
+        <w:rPr>
+          <w:rFonts w:ascii="Times New Roman" w:eastAsia="Times New Roman" w:hAnsi="Times New Roman" w:cs="Times New Roman"/>
+          <w:b/>
+          <w:bCs/>
+          <w:sz w:val="24"/>
+          <w:szCs w:val="24"/>
+        </w:rPr>
+        <w:t>debe</w:t>
+      </w:r>
+      <w:r>
+        <w:rPr>
+          <w:rFonts w:ascii="Times New Roman" w:eastAsia="Times New Roman" w:hAnsi="Times New Roman" w:cs="Times New Roman"/>
+          <w:sz w:val="24"/>
+          <w:szCs w:val="24"/>
+        </w:rPr>
+        <w:t xml:space="preserve"> realizar </w:t>
+      </w:r>
+      <w:proofErr w:type="spellStart"/>
+      <w:r>
+        <w:rPr>
+          <w:rFonts w:ascii="Times New Roman" w:eastAsia="Times New Roman" w:hAnsi="Times New Roman" w:cs="Times New Roman"/>
+          <w:sz w:val="24"/>
+          <w:szCs w:val="24"/>
+        </w:rPr>
+        <w:t>backups</w:t>
+      </w:r>
+      <w:proofErr w:type="spellEnd"/>
+      <w:r>
+        <w:rPr>
+          <w:rFonts w:ascii="Times New Roman" w:eastAsia="Times New Roman" w:hAnsi="Times New Roman" w:cs="Times New Roman"/>
+          <w:sz w:val="24"/>
+          <w:szCs w:val="24"/>
+        </w:rPr>
+        <w:t xml:space="preserve"> automáticos diarios de bases de datos y activos.</w:t>
+      </w:r>
+    </w:p>
+    <w:p>
+      <w:pPr>
+        <w:numPr>
+          <w:ilvl w:val="0"/>
+          <w:numId w:val="17"/>
+        </w:numPr>
+        <w:spacing w:before="100" w:beforeAutospacing="1" w:after="100" w:afterAutospacing="1" w:line="240" w:lineRule="auto"/>
+        <w:rPr>
+          <w:rFonts w:ascii="Times New Roman" w:eastAsia="Times New Roman" w:hAnsi="Times New Roman" w:cs="Times New Roman"/>
+          <w:sz w:val="24"/>
+          <w:szCs w:val="24"/>
+        </w:rPr>
+      </w:pPr>
+      <w:r>
+        <w:rPr>
+          <w:rFonts w:ascii="Times New Roman" w:eastAsia="Times New Roman" w:hAnsi="Times New Roman" w:cs="Times New Roman"/>
+          <w:b/>
+          <w:bCs/>
+          <w:sz w:val="24"/>
+          <w:szCs w:val="24"/>
+        </w:rPr>
+        <w:t>RNF-16:</w:t>
+      </w:r>
+      <w:r>
+        <w:rPr>
+          <w:rFonts w:ascii="Times New Roman" w:eastAsia="Times New Roman" w:hAnsi="Times New Roman" w:cs="Times New Roman"/>
+          <w:sz w:val="24"/>
+          <w:szCs w:val="24"/>
+        </w:rPr>
+        <w:t xml:space="preserve"> El sistema </w:t>
+      </w:r>
+      <w:r>
+        <w:rPr>
+          <w:rFonts w:ascii="Times New Roman" w:eastAsia="Times New Roman" w:hAnsi="Times New Roman" w:cs="Times New Roman"/>
+          <w:b/>
+          <w:bCs/>
+          <w:sz w:val="24"/>
+          <w:szCs w:val="24"/>
+        </w:rPr>
+        <w:t>debe</w:t>
+      </w:r>
+      <w:r>
+        <w:rPr>
+          <w:rFonts w:ascii="Times New Roman" w:eastAsia="Times New Roman" w:hAnsi="Times New Roman" w:cs="Times New Roman"/>
+          <w:sz w:val="24"/>
+          <w:szCs w:val="24"/>
+        </w:rPr>
+        <w:t xml:space="preserve"> permitir la recuperación total ante fallos críticos o corrupción de datos.</w:t>
       </w:r>
     </w:p>
     <w:p/>
@@ -2020,6 +3348,155 @@
 <file path=word/numbering.xml><?xml version="1.0" encoding="utf-8"?>
 <w:numbering xmlns:wpc="http://schemas.microsoft.com/office/word/2010/wordprocessingCanvas" xmlns:cx="http://schemas.microsoft.com/office/drawing/2014/chartex" xmlns:cx1="http://schemas.microsoft.com/office/drawing/2015/9/8/chartex" xmlns:cx2="http://schemas.microsoft.com/office/drawing/2015/10/21/chartex" xmlns:cx3="http://schemas.microsoft.com/office/drawing/2016/5/9/chartex" xmlns:cx4="http://schemas.microsoft.com/office/drawing/2016/5/10/chartex" xmlns:cx5="http://schemas.microsoft.com/office/drawing/2016/5/11/chartex" xmlns:cx6="http://schemas.microsoft.com/office/drawing/2016/5/12/chartex" xmlns:cx7="http://schemas.microsoft.com/office/drawing/2016/5/13/chartex" xmlns:cx8="http://schemas.microsoft.com/office/drawing/2016/5/14/chartex" xmlns:mc="http://schemas.openxmlformats.org/markup-compatibility/2006" xmlns:aink="http://schemas.microsoft.com/office/drawing/2016/ink" xmlns:am3d="http://schemas.microsoft.com/office/drawing/2017/model3d" xmlns:o="urn:schemas-microsoft-com:office:office" xmlns:r="http://schemas.openxmlformats.org/officeDocument/2006/relationships" xmlns:m="http://schemas.openxmlformats.org/officeDocument/2006/math" xmlns:v="urn:schemas-microsoft-com:vml" xmlns:wp14="http://schemas.microsoft.com/office/word/2010/wordprocessingDrawing" xmlns:wp="http://schemas.openxmlformats.org/drawingml/2006/wordprocessingDrawing" xmlns:w10="urn:schemas-microsoft-com:office:word" xmlns:w="http://schemas.openxmlformats.org/wordprocessingml/2006/main" xmlns:w14="http://schemas.microsoft.com/office/word/2010/wordml" xmlns:w15="http://schemas.microsoft.com/office/word/2012/wordml" xmlns:w16cex="http://schemas.microsoft.com/office/word/2018/wordml/cex" xmlns:w16cid="http://schemas.microsoft.com/office/word/2016/wordml/cid" xmlns:w16="http://schemas.microsoft.com/office/word/2018/wordml" xmlns:w16sdtdh="http://schemas.microsoft.com/office/word/2020/wordml/sdtdatahash" xmlns:w16se="http://schemas.microsoft.com/office/word/2015/wordml/symex" xmlns:wpg="http://schemas.microsoft.com/office/word/2010/wordprocessingGroup" xmlns:wpi="http://schemas.microsoft.com/office/word/2010/wordprocessingInk" xmlns:wne="http://schemas.microsoft.com/office/word/2006/wordml" xmlns:wps="http://schemas.microsoft.com/office/word/2010/wordprocessingShape" mc:Ignorable="w14 w15 w16se w16cid w16 w16cex w16sdtdh wp14">
   <w:abstractNum w:abstractNumId="0" w15:restartNumberingAfterBreak="0">
+    <w:nsid w:val="0A1E6287"/>
+    <w:multiLevelType w:val="multilevel"/>
+    <w:tmpl w:val="522A8E08"/>
+    <w:lvl w:ilvl="0">
+      <w:start w:val="1"/>
+      <w:numFmt w:val="bullet"/>
+      <w:lvlText w:val=""/>
+      <w:lvlJc w:val="left"/>
+      <w:pPr>
+        <w:tabs>
+          <w:tab w:val="num" w:pos="720"/>
+        </w:tabs>
+        <w:ind w:left="720" w:hanging="360"/>
+      </w:pPr>
+      <w:rPr>
+        <w:rFonts w:ascii="Symbol" w:hAnsi="Symbol" w:hint="default"/>
+        <w:sz w:val="20"/>
+      </w:rPr>
+    </w:lvl>
+    <w:lvl w:ilvl="1" w:tentative="1">
+      <w:start w:val="1"/>
+      <w:numFmt w:val="bullet"/>
+      <w:lvlText w:val="o"/>
+      <w:lvlJc w:val="left"/>
+      <w:pPr>
+        <w:tabs>
+          <w:tab w:val="num" w:pos="1440"/>
+        </w:tabs>
+        <w:ind w:left="1440" w:hanging="360"/>
+      </w:pPr>
+      <w:rPr>
+        <w:rFonts w:ascii="Courier New" w:hAnsi="Courier New" w:hint="default"/>
+        <w:sz w:val="20"/>
+      </w:rPr>
+    </w:lvl>
+    <w:lvl w:ilvl="2" w:tentative="1">
+      <w:start w:val="1"/>
+      <w:numFmt w:val="bullet"/>
+      <w:lvlText w:val=""/>
+      <w:lvlJc w:val="left"/>
+      <w:pPr>
+        <w:tabs>
+          <w:tab w:val="num" w:pos="2160"/>
+        </w:tabs>
+        <w:ind w:left="2160" w:hanging="360"/>
+      </w:pPr>
+      <w:rPr>
+        <w:rFonts w:ascii="Wingdings" w:hAnsi="Wingdings" w:hint="default"/>
+        <w:sz w:val="20"/>
+      </w:rPr>
+    </w:lvl>
+    <w:lvl w:ilvl="3" w:tentative="1">
+      <w:start w:val="1"/>
+      <w:numFmt w:val="bullet"/>
+      <w:lvlText w:val=""/>
+      <w:lvlJc w:val="left"/>
+      <w:pPr>
+        <w:tabs>
+          <w:tab w:val="num" w:pos="2880"/>
+        </w:tabs>
+        <w:ind w:left="2880" w:hanging="360"/>
+      </w:pPr>
+      <w:rPr>
+        <w:rFonts w:ascii="Wingdings" w:hAnsi="Wingdings" w:hint="default"/>
+        <w:sz w:val="20"/>
+      </w:rPr>
+    </w:lvl>
+    <w:lvl w:ilvl="4" w:tentative="1">
+      <w:start w:val="1"/>
+      <w:numFmt w:val="bullet"/>
+      <w:lvlText w:val=""/>
+      <w:lvlJc w:val="left"/>
+      <w:pPr>
+        <w:tabs>
+          <w:tab w:val="num" w:pos="3600"/>
+        </w:tabs>
+        <w:ind w:left="3600" w:hanging="360"/>
+      </w:pPr>
+      <w:rPr>
+        <w:rFonts w:ascii="Wingdings" w:hAnsi="Wingdings" w:hint="default"/>
+        <w:sz w:val="20"/>
+      </w:rPr>
+    </w:lvl>
+    <w:lvl w:ilvl="5" w:tentative="1">
+      <w:start w:val="1"/>
+      <w:numFmt w:val="bullet"/>
+      <w:lvlText w:val=""/>
+      <w:lvlJc w:val="left"/>
+      <w:pPr>
+        <w:tabs>
+          <w:tab w:val="num" w:pos="4320"/>
+        </w:tabs>
+        <w:ind w:left="4320" w:hanging="360"/>
+      </w:pPr>
+      <w:rPr>
+        <w:rFonts w:ascii="Wingdings" w:hAnsi="Wingdings" w:hint="default"/>
+        <w:sz w:val="20"/>
+      </w:rPr>
+    </w:lvl>
+    <w:lvl w:ilvl="6" w:tentative="1">
+      <w:start w:val="1"/>
+      <w:numFmt w:val="bullet"/>
+      <w:lvlText w:val=""/>
+      <w:lvlJc w:val="left"/>
+      <w:pPr>
+        <w:tabs>
+          <w:tab w:val="num" w:pos="5040"/>
+        </w:tabs>
+        <w:ind w:left="5040" w:hanging="360"/>
+      </w:pPr>
+      <w:rPr>
+        <w:rFonts w:ascii="Wingdings" w:hAnsi="Wingdings" w:hint="default"/>
+        <w:sz w:val="20"/>
+      </w:rPr>
+    </w:lvl>
+    <w:lvl w:ilvl="7" w:tentative="1">
+      <w:start w:val="1"/>
+      <w:numFmt w:val="bullet"/>
+      <w:lvlText w:val=""/>
+      <w:lvlJc w:val="left"/>
+      <w:pPr>
+        <w:tabs>
+          <w:tab w:val="num" w:pos="5760"/>
+        </w:tabs>
+        <w:ind w:left="5760" w:hanging="360"/>
+      </w:pPr>
+      <w:rPr>
+        <w:rFonts w:ascii="Wingdings" w:hAnsi="Wingdings" w:hint="default"/>
+        <w:sz w:val="20"/>
+      </w:rPr>
+    </w:lvl>
+    <w:lvl w:ilvl="8" w:tentative="1">
+      <w:start w:val="1"/>
+      <w:numFmt w:val="bullet"/>
+      <w:lvlText w:val=""/>
+      <w:lvlJc w:val="left"/>
+      <w:pPr>
+        <w:tabs>
+          <w:tab w:val="num" w:pos="6480"/>
+        </w:tabs>
+        <w:ind w:left="6480" w:hanging="360"/>
+      </w:pPr>
+      <w:rPr>
+        <w:rFonts w:ascii="Wingdings" w:hAnsi="Wingdings" w:hint="default"/>
+        <w:sz w:val="20"/>
+      </w:rPr>
+    </w:lvl>
+  </w:abstractNum>
+  <w:abstractNum w:abstractNumId="1" w15:restartNumberingAfterBreak="0">
     <w:nsid w:val="17AB2232"/>
     <w:multiLevelType w:val="multilevel"/>
     <w:tmpl w:val="0EDEAACC"/>
@@ -2168,7 +3645,305 @@
       </w:rPr>
     </w:lvl>
   </w:abstractNum>
-  <w:abstractNum w:abstractNumId="1" w15:restartNumberingAfterBreak="0">
+  <w:abstractNum w:abstractNumId="2" w15:restartNumberingAfterBreak="0">
+    <w:nsid w:val="214F0B0F"/>
+    <w:multiLevelType w:val="multilevel"/>
+    <w:tmpl w:val="BACEFF16"/>
+    <w:lvl w:ilvl="0">
+      <w:start w:val="1"/>
+      <w:numFmt w:val="bullet"/>
+      <w:lvlText w:val=""/>
+      <w:lvlJc w:val="left"/>
+      <w:pPr>
+        <w:tabs>
+          <w:tab w:val="num" w:pos="720"/>
+        </w:tabs>
+        <w:ind w:left="720" w:hanging="360"/>
+      </w:pPr>
+      <w:rPr>
+        <w:rFonts w:ascii="Symbol" w:hAnsi="Symbol" w:hint="default"/>
+        <w:sz w:val="20"/>
+      </w:rPr>
+    </w:lvl>
+    <w:lvl w:ilvl="1" w:tentative="1">
+      <w:start w:val="1"/>
+      <w:numFmt w:val="bullet"/>
+      <w:lvlText w:val="o"/>
+      <w:lvlJc w:val="left"/>
+      <w:pPr>
+        <w:tabs>
+          <w:tab w:val="num" w:pos="1440"/>
+        </w:tabs>
+        <w:ind w:left="1440" w:hanging="360"/>
+      </w:pPr>
+      <w:rPr>
+        <w:rFonts w:ascii="Courier New" w:hAnsi="Courier New" w:hint="default"/>
+        <w:sz w:val="20"/>
+      </w:rPr>
+    </w:lvl>
+    <w:lvl w:ilvl="2" w:tentative="1">
+      <w:start w:val="1"/>
+      <w:numFmt w:val="bullet"/>
+      <w:lvlText w:val=""/>
+      <w:lvlJc w:val="left"/>
+      <w:pPr>
+        <w:tabs>
+          <w:tab w:val="num" w:pos="2160"/>
+        </w:tabs>
+        <w:ind w:left="2160" w:hanging="360"/>
+      </w:pPr>
+      <w:rPr>
+        <w:rFonts w:ascii="Wingdings" w:hAnsi="Wingdings" w:hint="default"/>
+        <w:sz w:val="20"/>
+      </w:rPr>
+    </w:lvl>
+    <w:lvl w:ilvl="3" w:tentative="1">
+      <w:start w:val="1"/>
+      <w:numFmt w:val="bullet"/>
+      <w:lvlText w:val=""/>
+      <w:lvlJc w:val="left"/>
+      <w:pPr>
+        <w:tabs>
+          <w:tab w:val="num" w:pos="2880"/>
+        </w:tabs>
+        <w:ind w:left="2880" w:hanging="360"/>
+      </w:pPr>
+      <w:rPr>
+        <w:rFonts w:ascii="Wingdings" w:hAnsi="Wingdings" w:hint="default"/>
+        <w:sz w:val="20"/>
+      </w:rPr>
+    </w:lvl>
+    <w:lvl w:ilvl="4" w:tentative="1">
+      <w:start w:val="1"/>
+      <w:numFmt w:val="bullet"/>
+      <w:lvlText w:val=""/>
+      <w:lvlJc w:val="left"/>
+      <w:pPr>
+        <w:tabs>
+          <w:tab w:val="num" w:pos="3600"/>
+        </w:tabs>
+        <w:ind w:left="3600" w:hanging="360"/>
+      </w:pPr>
+      <w:rPr>
+        <w:rFonts w:ascii="Wingdings" w:hAnsi="Wingdings" w:hint="default"/>
+        <w:sz w:val="20"/>
+      </w:rPr>
+    </w:lvl>
+    <w:lvl w:ilvl="5" w:tentative="1">
+      <w:start w:val="1"/>
+      <w:numFmt w:val="bullet"/>
+      <w:lvlText w:val=""/>
+      <w:lvlJc w:val="left"/>
+      <w:pPr>
+        <w:tabs>
+          <w:tab w:val="num" w:pos="4320"/>
+        </w:tabs>
+        <w:ind w:left="4320" w:hanging="360"/>
+      </w:pPr>
+      <w:rPr>
+        <w:rFonts w:ascii="Wingdings" w:hAnsi="Wingdings" w:hint="default"/>
+        <w:sz w:val="20"/>
+      </w:rPr>
+    </w:lvl>
+    <w:lvl w:ilvl="6" w:tentative="1">
+      <w:start w:val="1"/>
+      <w:numFmt w:val="bullet"/>
+      <w:lvlText w:val=""/>
+      <w:lvlJc w:val="left"/>
+      <w:pPr>
+        <w:tabs>
+          <w:tab w:val="num" w:pos="5040"/>
+        </w:tabs>
+        <w:ind w:left="5040" w:hanging="360"/>
+      </w:pPr>
+      <w:rPr>
+        <w:rFonts w:ascii="Wingdings" w:hAnsi="Wingdings" w:hint="default"/>
+        <w:sz w:val="20"/>
+      </w:rPr>
+    </w:lvl>
+    <w:lvl w:ilvl="7" w:tentative="1">
+      <w:start w:val="1"/>
+      <w:numFmt w:val="bullet"/>
+      <w:lvlText w:val=""/>
+      <w:lvlJc w:val="left"/>
+      <w:pPr>
+        <w:tabs>
+          <w:tab w:val="num" w:pos="5760"/>
+        </w:tabs>
+        <w:ind w:left="5760" w:hanging="360"/>
+      </w:pPr>
+      <w:rPr>
+        <w:rFonts w:ascii="Wingdings" w:hAnsi="Wingdings" w:hint="default"/>
+        <w:sz w:val="20"/>
+      </w:rPr>
+    </w:lvl>
+    <w:lvl w:ilvl="8" w:tentative="1">
+      <w:start w:val="1"/>
+      <w:numFmt w:val="bullet"/>
+      <w:lvlText w:val=""/>
+      <w:lvlJc w:val="left"/>
+      <w:pPr>
+        <w:tabs>
+          <w:tab w:val="num" w:pos="6480"/>
+        </w:tabs>
+        <w:ind w:left="6480" w:hanging="360"/>
+      </w:pPr>
+      <w:rPr>
+        <w:rFonts w:ascii="Wingdings" w:hAnsi="Wingdings" w:hint="default"/>
+        <w:sz w:val="20"/>
+      </w:rPr>
+    </w:lvl>
+  </w:abstractNum>
+  <w:abstractNum w:abstractNumId="3" w15:restartNumberingAfterBreak="0">
+    <w:nsid w:val="23A652AD"/>
+    <w:multiLevelType w:val="multilevel"/>
+    <w:tmpl w:val="D5965360"/>
+    <w:lvl w:ilvl="0">
+      <w:start w:val="1"/>
+      <w:numFmt w:val="bullet"/>
+      <w:lvlText w:val=""/>
+      <w:lvlJc w:val="left"/>
+      <w:pPr>
+        <w:tabs>
+          <w:tab w:val="num" w:pos="720"/>
+        </w:tabs>
+        <w:ind w:left="720" w:hanging="360"/>
+      </w:pPr>
+      <w:rPr>
+        <w:rFonts w:ascii="Symbol" w:hAnsi="Symbol" w:hint="default"/>
+        <w:sz w:val="20"/>
+      </w:rPr>
+    </w:lvl>
+    <w:lvl w:ilvl="1" w:tentative="1">
+      <w:start w:val="1"/>
+      <w:numFmt w:val="bullet"/>
+      <w:lvlText w:val="o"/>
+      <w:lvlJc w:val="left"/>
+      <w:pPr>
+        <w:tabs>
+          <w:tab w:val="num" w:pos="1440"/>
+        </w:tabs>
+        <w:ind w:left="1440" w:hanging="360"/>
+      </w:pPr>
+      <w:rPr>
+        <w:rFonts w:ascii="Courier New" w:hAnsi="Courier New" w:hint="default"/>
+        <w:sz w:val="20"/>
+      </w:rPr>
+    </w:lvl>
+    <w:lvl w:ilvl="2" w:tentative="1">
+      <w:start w:val="1"/>
+      <w:numFmt w:val="bullet"/>
+      <w:lvlText w:val=""/>
+      <w:lvlJc w:val="left"/>
+      <w:pPr>
+        <w:tabs>
+          <w:tab w:val="num" w:pos="2160"/>
+        </w:tabs>
+        <w:ind w:left="2160" w:hanging="360"/>
+      </w:pPr>
+      <w:rPr>
+        <w:rFonts w:ascii="Wingdings" w:hAnsi="Wingdings" w:hint="default"/>
+        <w:sz w:val="20"/>
+      </w:rPr>
+    </w:lvl>
+    <w:lvl w:ilvl="3" w:tentative="1">
+      <w:start w:val="1"/>
+      <w:numFmt w:val="bullet"/>
+      <w:lvlText w:val=""/>
+      <w:lvlJc w:val="left"/>
+      <w:pPr>
+        <w:tabs>
+          <w:tab w:val="num" w:pos="2880"/>
+        </w:tabs>
+        <w:ind w:left="2880" w:hanging="360"/>
+      </w:pPr>
+      <w:rPr>
+        <w:rFonts w:ascii="Wingdings" w:hAnsi="Wingdings" w:hint="default"/>
+        <w:sz w:val="20"/>
+      </w:rPr>
+    </w:lvl>
+    <w:lvl w:ilvl="4" w:tentative="1">
+      <w:start w:val="1"/>
+      <w:numFmt w:val="bullet"/>
+      <w:lvlText w:val=""/>
+      <w:lvlJc w:val="left"/>
+      <w:pPr>
+        <w:tabs>
+          <w:tab w:val="num" w:pos="3600"/>
+        </w:tabs>
+        <w:ind w:left="3600" w:hanging="360"/>
+      </w:pPr>
+      <w:rPr>
+        <w:rFonts w:ascii="Wingdings" w:hAnsi="Wingdings" w:hint="default"/>
+        <w:sz w:val="20"/>
+      </w:rPr>
+    </w:lvl>
+    <w:lvl w:ilvl="5" w:tentative="1">
+      <w:start w:val="1"/>
+      <w:numFmt w:val="bullet"/>
+      <w:lvlText w:val=""/>
+      <w:lvlJc w:val="left"/>
+      <w:pPr>
+        <w:tabs>
+          <w:tab w:val="num" w:pos="4320"/>
+        </w:tabs>
+        <w:ind w:left="4320" w:hanging="360"/>
+      </w:pPr>
+      <w:rPr>
+        <w:rFonts w:ascii="Wingdings" w:hAnsi="Wingdings" w:hint="default"/>
+        <w:sz w:val="20"/>
+      </w:rPr>
+    </w:lvl>
+    <w:lvl w:ilvl="6" w:tentative="1">
+      <w:start w:val="1"/>
+      <w:numFmt w:val="bullet"/>
+      <w:lvlText w:val=""/>
+      <w:lvlJc w:val="left"/>
+      <w:pPr>
+        <w:tabs>
+          <w:tab w:val="num" w:pos="5040"/>
+        </w:tabs>
+        <w:ind w:left="5040" w:hanging="360"/>
+      </w:pPr>
+      <w:rPr>
+        <w:rFonts w:ascii="Wingdings" w:hAnsi="Wingdings" w:hint="default"/>
+        <w:sz w:val="20"/>
+      </w:rPr>
+    </w:lvl>
+    <w:lvl w:ilvl="7" w:tentative="1">
+      <w:start w:val="1"/>
+      <w:numFmt w:val="bullet"/>
+      <w:lvlText w:val=""/>
+      <w:lvlJc w:val="left"/>
+      <w:pPr>
+        <w:tabs>
+          <w:tab w:val="num" w:pos="5760"/>
+        </w:tabs>
+        <w:ind w:left="5760" w:hanging="360"/>
+      </w:pPr>
+      <w:rPr>
+        <w:rFonts w:ascii="Wingdings" w:hAnsi="Wingdings" w:hint="default"/>
+        <w:sz w:val="20"/>
+      </w:rPr>
+    </w:lvl>
+    <w:lvl w:ilvl="8" w:tentative="1">
+      <w:start w:val="1"/>
+      <w:numFmt w:val="bullet"/>
+      <w:lvlText w:val=""/>
+      <w:lvlJc w:val="left"/>
+      <w:pPr>
+        <w:tabs>
+          <w:tab w:val="num" w:pos="6480"/>
+        </w:tabs>
+        <w:ind w:left="6480" w:hanging="360"/>
+      </w:pPr>
+      <w:rPr>
+        <w:rFonts w:ascii="Wingdings" w:hAnsi="Wingdings" w:hint="default"/>
+        <w:sz w:val="20"/>
+      </w:rPr>
+    </w:lvl>
+  </w:abstractNum>
+  <w:abstractNum w:abstractNumId="4" w15:restartNumberingAfterBreak="0">
     <w:nsid w:val="2AAE15B4"/>
     <w:multiLevelType w:val="multilevel"/>
     <w:tmpl w:val="83FE0DEC"/>
@@ -2317,7 +4092,454 @@
       </w:rPr>
     </w:lvl>
   </w:abstractNum>
-  <w:abstractNum w:abstractNumId="2" w15:restartNumberingAfterBreak="0">
+  <w:abstractNum w:abstractNumId="5" w15:restartNumberingAfterBreak="0">
+    <w:nsid w:val="30520961"/>
+    <w:multiLevelType w:val="multilevel"/>
+    <w:tmpl w:val="02F264F0"/>
+    <w:lvl w:ilvl="0">
+      <w:start w:val="1"/>
+      <w:numFmt w:val="bullet"/>
+      <w:lvlText w:val=""/>
+      <w:lvlJc w:val="left"/>
+      <w:pPr>
+        <w:tabs>
+          <w:tab w:val="num" w:pos="720"/>
+        </w:tabs>
+        <w:ind w:left="720" w:hanging="360"/>
+      </w:pPr>
+      <w:rPr>
+        <w:rFonts w:ascii="Symbol" w:hAnsi="Symbol" w:hint="default"/>
+        <w:sz w:val="20"/>
+      </w:rPr>
+    </w:lvl>
+    <w:lvl w:ilvl="1" w:tentative="1">
+      <w:start w:val="1"/>
+      <w:numFmt w:val="bullet"/>
+      <w:lvlText w:val="o"/>
+      <w:lvlJc w:val="left"/>
+      <w:pPr>
+        <w:tabs>
+          <w:tab w:val="num" w:pos="1440"/>
+        </w:tabs>
+        <w:ind w:left="1440" w:hanging="360"/>
+      </w:pPr>
+      <w:rPr>
+        <w:rFonts w:ascii="Courier New" w:hAnsi="Courier New" w:hint="default"/>
+        <w:sz w:val="20"/>
+      </w:rPr>
+    </w:lvl>
+    <w:lvl w:ilvl="2" w:tentative="1">
+      <w:start w:val="1"/>
+      <w:numFmt w:val="bullet"/>
+      <w:lvlText w:val=""/>
+      <w:lvlJc w:val="left"/>
+      <w:pPr>
+        <w:tabs>
+          <w:tab w:val="num" w:pos="2160"/>
+        </w:tabs>
+        <w:ind w:left="2160" w:hanging="360"/>
+      </w:pPr>
+      <w:rPr>
+        <w:rFonts w:ascii="Wingdings" w:hAnsi="Wingdings" w:hint="default"/>
+        <w:sz w:val="20"/>
+      </w:rPr>
+    </w:lvl>
+    <w:lvl w:ilvl="3" w:tentative="1">
+      <w:start w:val="1"/>
+      <w:numFmt w:val="bullet"/>
+      <w:lvlText w:val=""/>
+      <w:lvlJc w:val="left"/>
+      <w:pPr>
+        <w:tabs>
+          <w:tab w:val="num" w:pos="2880"/>
+        </w:tabs>
+        <w:ind w:left="2880" w:hanging="360"/>
+      </w:pPr>
+      <w:rPr>
+        <w:rFonts w:ascii="Wingdings" w:hAnsi="Wingdings" w:hint="default"/>
+        <w:sz w:val="20"/>
+      </w:rPr>
+    </w:lvl>
+    <w:lvl w:ilvl="4" w:tentative="1">
+      <w:start w:val="1"/>
+      <w:numFmt w:val="bullet"/>
+      <w:lvlText w:val=""/>
+      <w:lvlJc w:val="left"/>
+      <w:pPr>
+        <w:tabs>
+          <w:tab w:val="num" w:pos="3600"/>
+        </w:tabs>
+        <w:ind w:left="3600" w:hanging="360"/>
+      </w:pPr>
+      <w:rPr>
+        <w:rFonts w:ascii="Wingdings" w:hAnsi="Wingdings" w:hint="default"/>
+        <w:sz w:val="20"/>
+      </w:rPr>
+    </w:lvl>
+    <w:lvl w:ilvl="5" w:tentative="1">
+      <w:start w:val="1"/>
+      <w:numFmt w:val="bullet"/>
+      <w:lvlText w:val=""/>
+      <w:lvlJc w:val="left"/>
+      <w:pPr>
+        <w:tabs>
+          <w:tab w:val="num" w:pos="4320"/>
+        </w:tabs>
+        <w:ind w:left="4320" w:hanging="360"/>
+      </w:pPr>
+      <w:rPr>
+        <w:rFonts w:ascii="Wingdings" w:hAnsi="Wingdings" w:hint="default"/>
+        <w:sz w:val="20"/>
+      </w:rPr>
+    </w:lvl>
+    <w:lvl w:ilvl="6" w:tentative="1">
+      <w:start w:val="1"/>
+      <w:numFmt w:val="bullet"/>
+      <w:lvlText w:val=""/>
+      <w:lvlJc w:val="left"/>
+      <w:pPr>
+        <w:tabs>
+          <w:tab w:val="num" w:pos="5040"/>
+        </w:tabs>
+        <w:ind w:left="5040" w:hanging="360"/>
+      </w:pPr>
+      <w:rPr>
+        <w:rFonts w:ascii="Wingdings" w:hAnsi="Wingdings" w:hint="default"/>
+        <w:sz w:val="20"/>
+      </w:rPr>
+    </w:lvl>
+    <w:lvl w:ilvl="7" w:tentative="1">
+      <w:start w:val="1"/>
+      <w:numFmt w:val="bullet"/>
+      <w:lvlText w:val=""/>
+      <w:lvlJc w:val="left"/>
+      <w:pPr>
+        <w:tabs>
+          <w:tab w:val="num" w:pos="5760"/>
+        </w:tabs>
+        <w:ind w:left="5760" w:hanging="360"/>
+      </w:pPr>
+      <w:rPr>
+        <w:rFonts w:ascii="Wingdings" w:hAnsi="Wingdings" w:hint="default"/>
+        <w:sz w:val="20"/>
+      </w:rPr>
+    </w:lvl>
+    <w:lvl w:ilvl="8" w:tentative="1">
+      <w:start w:val="1"/>
+      <w:numFmt w:val="bullet"/>
+      <w:lvlText w:val=""/>
+      <w:lvlJc w:val="left"/>
+      <w:pPr>
+        <w:tabs>
+          <w:tab w:val="num" w:pos="6480"/>
+        </w:tabs>
+        <w:ind w:left="6480" w:hanging="360"/>
+      </w:pPr>
+      <w:rPr>
+        <w:rFonts w:ascii="Wingdings" w:hAnsi="Wingdings" w:hint="default"/>
+        <w:sz w:val="20"/>
+      </w:rPr>
+    </w:lvl>
+  </w:abstractNum>
+  <w:abstractNum w:abstractNumId="6" w15:restartNumberingAfterBreak="0">
+    <w:nsid w:val="32EA7F2C"/>
+    <w:multiLevelType w:val="multilevel"/>
+    <w:tmpl w:val="15E2E5AA"/>
+    <w:lvl w:ilvl="0">
+      <w:start w:val="1"/>
+      <w:numFmt w:val="bullet"/>
+      <w:lvlText w:val=""/>
+      <w:lvlJc w:val="left"/>
+      <w:pPr>
+        <w:tabs>
+          <w:tab w:val="num" w:pos="720"/>
+        </w:tabs>
+        <w:ind w:left="720" w:hanging="360"/>
+      </w:pPr>
+      <w:rPr>
+        <w:rFonts w:ascii="Symbol" w:hAnsi="Symbol" w:hint="default"/>
+        <w:sz w:val="20"/>
+      </w:rPr>
+    </w:lvl>
+    <w:lvl w:ilvl="1" w:tentative="1">
+      <w:start w:val="1"/>
+      <w:numFmt w:val="bullet"/>
+      <w:lvlText w:val="o"/>
+      <w:lvlJc w:val="left"/>
+      <w:pPr>
+        <w:tabs>
+          <w:tab w:val="num" w:pos="1440"/>
+        </w:tabs>
+        <w:ind w:left="1440" w:hanging="360"/>
+      </w:pPr>
+      <w:rPr>
+        <w:rFonts w:ascii="Courier New" w:hAnsi="Courier New" w:hint="default"/>
+        <w:sz w:val="20"/>
+      </w:rPr>
+    </w:lvl>
+    <w:lvl w:ilvl="2" w:tentative="1">
+      <w:start w:val="1"/>
+      <w:numFmt w:val="bullet"/>
+      <w:lvlText w:val=""/>
+      <w:lvlJc w:val="left"/>
+      <w:pPr>
+        <w:tabs>
+          <w:tab w:val="num" w:pos="2160"/>
+        </w:tabs>
+        <w:ind w:left="2160" w:hanging="360"/>
+      </w:pPr>
+      <w:rPr>
+        <w:rFonts w:ascii="Wingdings" w:hAnsi="Wingdings" w:hint="default"/>
+        <w:sz w:val="20"/>
+      </w:rPr>
+    </w:lvl>
+    <w:lvl w:ilvl="3" w:tentative="1">
+      <w:start w:val="1"/>
+      <w:numFmt w:val="bullet"/>
+      <w:lvlText w:val=""/>
+      <w:lvlJc w:val="left"/>
+      <w:pPr>
+        <w:tabs>
+          <w:tab w:val="num" w:pos="2880"/>
+        </w:tabs>
+        <w:ind w:left="2880" w:hanging="360"/>
+      </w:pPr>
+      <w:rPr>
+        <w:rFonts w:ascii="Wingdings" w:hAnsi="Wingdings" w:hint="default"/>
+        <w:sz w:val="20"/>
+      </w:rPr>
+    </w:lvl>
+    <w:lvl w:ilvl="4" w:tentative="1">
+      <w:start w:val="1"/>
+      <w:numFmt w:val="bullet"/>
+      <w:lvlText w:val=""/>
+      <w:lvlJc w:val="left"/>
+      <w:pPr>
+        <w:tabs>
+          <w:tab w:val="num" w:pos="3600"/>
+        </w:tabs>
+        <w:ind w:left="3600" w:hanging="360"/>
+      </w:pPr>
+      <w:rPr>
+        <w:rFonts w:ascii="Wingdings" w:hAnsi="Wingdings" w:hint="default"/>
+        <w:sz w:val="20"/>
+      </w:rPr>
+    </w:lvl>
+    <w:lvl w:ilvl="5" w:tentative="1">
+      <w:start w:val="1"/>
+      <w:numFmt w:val="bullet"/>
+      <w:lvlText w:val=""/>
+      <w:lvlJc w:val="left"/>
+      <w:pPr>
+        <w:tabs>
+          <w:tab w:val="num" w:pos="4320"/>
+        </w:tabs>
+        <w:ind w:left="4320" w:hanging="360"/>
+      </w:pPr>
+      <w:rPr>
+        <w:rFonts w:ascii="Wingdings" w:hAnsi="Wingdings" w:hint="default"/>
+        <w:sz w:val="20"/>
+      </w:rPr>
+    </w:lvl>
+    <w:lvl w:ilvl="6" w:tentative="1">
+      <w:start w:val="1"/>
+      <w:numFmt w:val="bullet"/>
+      <w:lvlText w:val=""/>
+      <w:lvlJc w:val="left"/>
+      <w:pPr>
+        <w:tabs>
+          <w:tab w:val="num" w:pos="5040"/>
+        </w:tabs>
+        <w:ind w:left="5040" w:hanging="360"/>
+      </w:pPr>
+      <w:rPr>
+        <w:rFonts w:ascii="Wingdings" w:hAnsi="Wingdings" w:hint="default"/>
+        <w:sz w:val="20"/>
+      </w:rPr>
+    </w:lvl>
+    <w:lvl w:ilvl="7" w:tentative="1">
+      <w:start w:val="1"/>
+      <w:numFmt w:val="bullet"/>
+      <w:lvlText w:val=""/>
+      <w:lvlJc w:val="left"/>
+      <w:pPr>
+        <w:tabs>
+          <w:tab w:val="num" w:pos="5760"/>
+        </w:tabs>
+        <w:ind w:left="5760" w:hanging="360"/>
+      </w:pPr>
+      <w:rPr>
+        <w:rFonts w:ascii="Wingdings" w:hAnsi="Wingdings" w:hint="default"/>
+        <w:sz w:val="20"/>
+      </w:rPr>
+    </w:lvl>
+    <w:lvl w:ilvl="8" w:tentative="1">
+      <w:start w:val="1"/>
+      <w:numFmt w:val="bullet"/>
+      <w:lvlText w:val=""/>
+      <w:lvlJc w:val="left"/>
+      <w:pPr>
+        <w:tabs>
+          <w:tab w:val="num" w:pos="6480"/>
+        </w:tabs>
+        <w:ind w:left="6480" w:hanging="360"/>
+      </w:pPr>
+      <w:rPr>
+        <w:rFonts w:ascii="Wingdings" w:hAnsi="Wingdings" w:hint="default"/>
+        <w:sz w:val="20"/>
+      </w:rPr>
+    </w:lvl>
+  </w:abstractNum>
+  <w:abstractNum w:abstractNumId="7" w15:restartNumberingAfterBreak="0">
+    <w:nsid w:val="343B0508"/>
+    <w:multiLevelType w:val="multilevel"/>
+    <w:tmpl w:val="4140BD04"/>
+    <w:lvl w:ilvl="0">
+      <w:start w:val="1"/>
+      <w:numFmt w:val="bullet"/>
+      <w:lvlText w:val=""/>
+      <w:lvlJc w:val="left"/>
+      <w:pPr>
+        <w:tabs>
+          <w:tab w:val="num" w:pos="720"/>
+        </w:tabs>
+        <w:ind w:left="720" w:hanging="360"/>
+      </w:pPr>
+      <w:rPr>
+        <w:rFonts w:ascii="Symbol" w:hAnsi="Symbol" w:hint="default"/>
+        <w:sz w:val="20"/>
+      </w:rPr>
+    </w:lvl>
+    <w:lvl w:ilvl="1" w:tentative="1">
+      <w:start w:val="1"/>
+      <w:numFmt w:val="bullet"/>
+      <w:lvlText w:val="o"/>
+      <w:lvlJc w:val="left"/>
+      <w:pPr>
+        <w:tabs>
+          <w:tab w:val="num" w:pos="1440"/>
+        </w:tabs>
+        <w:ind w:left="1440" w:hanging="360"/>
+      </w:pPr>
+      <w:rPr>
+        <w:rFonts w:ascii="Courier New" w:hAnsi="Courier New" w:hint="default"/>
+        <w:sz w:val="20"/>
+      </w:rPr>
+    </w:lvl>
+    <w:lvl w:ilvl="2" w:tentative="1">
+      <w:start w:val="1"/>
+      <w:numFmt w:val="bullet"/>
+      <w:lvlText w:val=""/>
+      <w:lvlJc w:val="left"/>
+      <w:pPr>
+        <w:tabs>
+          <w:tab w:val="num" w:pos="2160"/>
+        </w:tabs>
+        <w:ind w:left="2160" w:hanging="360"/>
+      </w:pPr>
+      <w:rPr>
+        <w:rFonts w:ascii="Wingdings" w:hAnsi="Wingdings" w:hint="default"/>
+        <w:sz w:val="20"/>
+      </w:rPr>
+    </w:lvl>
+    <w:lvl w:ilvl="3" w:tentative="1">
+      <w:start w:val="1"/>
+      <w:numFmt w:val="bullet"/>
+      <w:lvlText w:val=""/>
+      <w:lvlJc w:val="left"/>
+      <w:pPr>
+        <w:tabs>
+          <w:tab w:val="num" w:pos="2880"/>
+        </w:tabs>
+        <w:ind w:left="2880" w:hanging="360"/>
+      </w:pPr>
+      <w:rPr>
+        <w:rFonts w:ascii="Wingdings" w:hAnsi="Wingdings" w:hint="default"/>
+        <w:sz w:val="20"/>
+      </w:rPr>
+    </w:lvl>
+    <w:lvl w:ilvl="4" w:tentative="1">
+      <w:start w:val="1"/>
+      <w:numFmt w:val="bullet"/>
+      <w:lvlText w:val=""/>
+      <w:lvlJc w:val="left"/>
+      <w:pPr>
+        <w:tabs>
+          <w:tab w:val="num" w:pos="3600"/>
+        </w:tabs>
+        <w:ind w:left="3600" w:hanging="360"/>
+      </w:pPr>
+      <w:rPr>
+        <w:rFonts w:ascii="Wingdings" w:hAnsi="Wingdings" w:hint="default"/>
+        <w:sz w:val="20"/>
+      </w:rPr>
+    </w:lvl>
+    <w:lvl w:ilvl="5" w:tentative="1">
+      <w:start w:val="1"/>
+      <w:numFmt w:val="bullet"/>
+      <w:lvlText w:val=""/>
+      <w:lvlJc w:val="left"/>
+      <w:pPr>
+        <w:tabs>
+          <w:tab w:val="num" w:pos="4320"/>
+        </w:tabs>
+        <w:ind w:left="4320" w:hanging="360"/>
+      </w:pPr>
+      <w:rPr>
+        <w:rFonts w:ascii="Wingdings" w:hAnsi="Wingdings" w:hint="default"/>
+        <w:sz w:val="20"/>
+      </w:rPr>
+    </w:lvl>
+    <w:lvl w:ilvl="6" w:tentative="1">
+      <w:start w:val="1"/>
+      <w:numFmt w:val="bullet"/>
+      <w:lvlText w:val=""/>
+      <w:lvlJc w:val="left"/>
+      <w:pPr>
+        <w:tabs>
+          <w:tab w:val="num" w:pos="5040"/>
+        </w:tabs>
+        <w:ind w:left="5040" w:hanging="360"/>
+      </w:pPr>
+      <w:rPr>
+        <w:rFonts w:ascii="Wingdings" w:hAnsi="Wingdings" w:hint="default"/>
+        <w:sz w:val="20"/>
+      </w:rPr>
+    </w:lvl>
+    <w:lvl w:ilvl="7" w:tentative="1">
+      <w:start w:val="1"/>
+      <w:numFmt w:val="bullet"/>
+      <w:lvlText w:val=""/>
+      <w:lvlJc w:val="left"/>
+      <w:pPr>
+        <w:tabs>
+          <w:tab w:val="num" w:pos="5760"/>
+        </w:tabs>
+        <w:ind w:left="5760" w:hanging="360"/>
+      </w:pPr>
+      <w:rPr>
+        <w:rFonts w:ascii="Wingdings" w:hAnsi="Wingdings" w:hint="default"/>
+        <w:sz w:val="20"/>
+      </w:rPr>
+    </w:lvl>
+    <w:lvl w:ilvl="8" w:tentative="1">
+      <w:start w:val="1"/>
+      <w:numFmt w:val="bullet"/>
+      <w:lvlText w:val=""/>
+      <w:lvlJc w:val="left"/>
+      <w:pPr>
+        <w:tabs>
+          <w:tab w:val="num" w:pos="6480"/>
+        </w:tabs>
+        <w:ind w:left="6480" w:hanging="360"/>
+      </w:pPr>
+      <w:rPr>
+        <w:rFonts w:ascii="Wingdings" w:hAnsi="Wingdings" w:hint="default"/>
+        <w:sz w:val="20"/>
+      </w:rPr>
+    </w:lvl>
+  </w:abstractNum>
+  <w:abstractNum w:abstractNumId="8" w15:restartNumberingAfterBreak="0">
     <w:nsid w:val="3E2B3C98"/>
     <w:multiLevelType w:val="multilevel"/>
     <w:tmpl w:val="B06CBC72"/>
@@ -2466,7 +4688,7 @@
       </w:rPr>
     </w:lvl>
   </w:abstractNum>
-  <w:abstractNum w:abstractNumId="3" w15:restartNumberingAfterBreak="0">
+  <w:abstractNum w:abstractNumId="9" w15:restartNumberingAfterBreak="0">
     <w:nsid w:val="45772652"/>
     <w:multiLevelType w:val="multilevel"/>
     <w:tmpl w:val="9A8A25B8"/>
@@ -2615,7 +4837,7 @@
       </w:rPr>
     </w:lvl>
   </w:abstractNum>
-  <w:abstractNum w:abstractNumId="4" w15:restartNumberingAfterBreak="0">
+  <w:abstractNum w:abstractNumId="10" w15:restartNumberingAfterBreak="0">
     <w:nsid w:val="4E91642C"/>
     <w:multiLevelType w:val="multilevel"/>
     <w:tmpl w:val="548626AA"/>
@@ -2764,7 +4986,305 @@
       </w:rPr>
     </w:lvl>
   </w:abstractNum>
-  <w:abstractNum w:abstractNumId="5" w15:restartNumberingAfterBreak="0">
+  <w:abstractNum w:abstractNumId="11" w15:restartNumberingAfterBreak="0">
+    <w:nsid w:val="5DF67E70"/>
+    <w:multiLevelType w:val="multilevel"/>
+    <w:tmpl w:val="C562D8B6"/>
+    <w:lvl w:ilvl="0">
+      <w:start w:val="1"/>
+      <w:numFmt w:val="bullet"/>
+      <w:lvlText w:val=""/>
+      <w:lvlJc w:val="left"/>
+      <w:pPr>
+        <w:tabs>
+          <w:tab w:val="num" w:pos="720"/>
+        </w:tabs>
+        <w:ind w:left="720" w:hanging="360"/>
+      </w:pPr>
+      <w:rPr>
+        <w:rFonts w:ascii="Symbol" w:hAnsi="Symbol" w:hint="default"/>
+        <w:sz w:val="20"/>
+      </w:rPr>
+    </w:lvl>
+    <w:lvl w:ilvl="1" w:tentative="1">
+      <w:start w:val="1"/>
+      <w:numFmt w:val="bullet"/>
+      <w:lvlText w:val="o"/>
+      <w:lvlJc w:val="left"/>
+      <w:pPr>
+        <w:tabs>
+          <w:tab w:val="num" w:pos="1440"/>
+        </w:tabs>
+        <w:ind w:left="1440" w:hanging="360"/>
+      </w:pPr>
+      <w:rPr>
+        <w:rFonts w:ascii="Courier New" w:hAnsi="Courier New" w:hint="default"/>
+        <w:sz w:val="20"/>
+      </w:rPr>
+    </w:lvl>
+    <w:lvl w:ilvl="2" w:tentative="1">
+      <w:start w:val="1"/>
+      <w:numFmt w:val="bullet"/>
+      <w:lvlText w:val=""/>
+      <w:lvlJc w:val="left"/>
+      <w:pPr>
+        <w:tabs>
+          <w:tab w:val="num" w:pos="2160"/>
+        </w:tabs>
+        <w:ind w:left="2160" w:hanging="360"/>
+      </w:pPr>
+      <w:rPr>
+        <w:rFonts w:ascii="Wingdings" w:hAnsi="Wingdings" w:hint="default"/>
+        <w:sz w:val="20"/>
+      </w:rPr>
+    </w:lvl>
+    <w:lvl w:ilvl="3" w:tentative="1">
+      <w:start w:val="1"/>
+      <w:numFmt w:val="bullet"/>
+      <w:lvlText w:val=""/>
+      <w:lvlJc w:val="left"/>
+      <w:pPr>
+        <w:tabs>
+          <w:tab w:val="num" w:pos="2880"/>
+        </w:tabs>
+        <w:ind w:left="2880" w:hanging="360"/>
+      </w:pPr>
+      <w:rPr>
+        <w:rFonts w:ascii="Wingdings" w:hAnsi="Wingdings" w:hint="default"/>
+        <w:sz w:val="20"/>
+      </w:rPr>
+    </w:lvl>
+    <w:lvl w:ilvl="4" w:tentative="1">
+      <w:start w:val="1"/>
+      <w:numFmt w:val="bullet"/>
+      <w:lvlText w:val=""/>
+      <w:lvlJc w:val="left"/>
+      <w:pPr>
+        <w:tabs>
+          <w:tab w:val="num" w:pos="3600"/>
+        </w:tabs>
+        <w:ind w:left="3600" w:hanging="360"/>
+      </w:pPr>
+      <w:rPr>
+        <w:rFonts w:ascii="Wingdings" w:hAnsi="Wingdings" w:hint="default"/>
+        <w:sz w:val="20"/>
+      </w:rPr>
+    </w:lvl>
+    <w:lvl w:ilvl="5" w:tentative="1">
+      <w:start w:val="1"/>
+      <w:numFmt w:val="bullet"/>
+      <w:lvlText w:val=""/>
+      <w:lvlJc w:val="left"/>
+      <w:pPr>
+        <w:tabs>
+          <w:tab w:val="num" w:pos="4320"/>
+        </w:tabs>
+        <w:ind w:left="4320" w:hanging="360"/>
+      </w:pPr>
+      <w:rPr>
+        <w:rFonts w:ascii="Wingdings" w:hAnsi="Wingdings" w:hint="default"/>
+        <w:sz w:val="20"/>
+      </w:rPr>
+    </w:lvl>
+    <w:lvl w:ilvl="6" w:tentative="1">
+      <w:start w:val="1"/>
+      <w:numFmt w:val="bullet"/>
+      <w:lvlText w:val=""/>
+      <w:lvlJc w:val="left"/>
+      <w:pPr>
+        <w:tabs>
+          <w:tab w:val="num" w:pos="5040"/>
+        </w:tabs>
+        <w:ind w:left="5040" w:hanging="360"/>
+      </w:pPr>
+      <w:rPr>
+        <w:rFonts w:ascii="Wingdings" w:hAnsi="Wingdings" w:hint="default"/>
+        <w:sz w:val="20"/>
+      </w:rPr>
+    </w:lvl>
+    <w:lvl w:ilvl="7" w:tentative="1">
+      <w:start w:val="1"/>
+      <w:numFmt w:val="bullet"/>
+      <w:lvlText w:val=""/>
+      <w:lvlJc w:val="left"/>
+      <w:pPr>
+        <w:tabs>
+          <w:tab w:val="num" w:pos="5760"/>
+        </w:tabs>
+        <w:ind w:left="5760" w:hanging="360"/>
+      </w:pPr>
+      <w:rPr>
+        <w:rFonts w:ascii="Wingdings" w:hAnsi="Wingdings" w:hint="default"/>
+        <w:sz w:val="20"/>
+      </w:rPr>
+    </w:lvl>
+    <w:lvl w:ilvl="8" w:tentative="1">
+      <w:start w:val="1"/>
+      <w:numFmt w:val="bullet"/>
+      <w:lvlText w:val=""/>
+      <w:lvlJc w:val="left"/>
+      <w:pPr>
+        <w:tabs>
+          <w:tab w:val="num" w:pos="6480"/>
+        </w:tabs>
+        <w:ind w:left="6480" w:hanging="360"/>
+      </w:pPr>
+      <w:rPr>
+        <w:rFonts w:ascii="Wingdings" w:hAnsi="Wingdings" w:hint="default"/>
+        <w:sz w:val="20"/>
+      </w:rPr>
+    </w:lvl>
+  </w:abstractNum>
+  <w:abstractNum w:abstractNumId="12" w15:restartNumberingAfterBreak="0">
+    <w:nsid w:val="5EB4752D"/>
+    <w:multiLevelType w:val="multilevel"/>
+    <w:tmpl w:val="1BA4D0F6"/>
+    <w:lvl w:ilvl="0">
+      <w:start w:val="1"/>
+      <w:numFmt w:val="bullet"/>
+      <w:lvlText w:val=""/>
+      <w:lvlJc w:val="left"/>
+      <w:pPr>
+        <w:tabs>
+          <w:tab w:val="num" w:pos="720"/>
+        </w:tabs>
+        <w:ind w:left="720" w:hanging="360"/>
+      </w:pPr>
+      <w:rPr>
+        <w:rFonts w:ascii="Symbol" w:hAnsi="Symbol" w:hint="default"/>
+        <w:sz w:val="20"/>
+      </w:rPr>
+    </w:lvl>
+    <w:lvl w:ilvl="1" w:tentative="1">
+      <w:start w:val="1"/>
+      <w:numFmt w:val="bullet"/>
+      <w:lvlText w:val="o"/>
+      <w:lvlJc w:val="left"/>
+      <w:pPr>
+        <w:tabs>
+          <w:tab w:val="num" w:pos="1440"/>
+        </w:tabs>
+        <w:ind w:left="1440" w:hanging="360"/>
+      </w:pPr>
+      <w:rPr>
+        <w:rFonts w:ascii="Courier New" w:hAnsi="Courier New" w:hint="default"/>
+        <w:sz w:val="20"/>
+      </w:rPr>
+    </w:lvl>
+    <w:lvl w:ilvl="2" w:tentative="1">
+      <w:start w:val="1"/>
+      <w:numFmt w:val="bullet"/>
+      <w:lvlText w:val=""/>
+      <w:lvlJc w:val="left"/>
+      <w:pPr>
+        <w:tabs>
+          <w:tab w:val="num" w:pos="2160"/>
+        </w:tabs>
+        <w:ind w:left="2160" w:hanging="360"/>
+      </w:pPr>
+      <w:rPr>
+        <w:rFonts w:ascii="Wingdings" w:hAnsi="Wingdings" w:hint="default"/>
+        <w:sz w:val="20"/>
+      </w:rPr>
+    </w:lvl>
+    <w:lvl w:ilvl="3" w:tentative="1">
+      <w:start w:val="1"/>
+      <w:numFmt w:val="bullet"/>
+      <w:lvlText w:val=""/>
+      <w:lvlJc w:val="left"/>
+      <w:pPr>
+        <w:tabs>
+          <w:tab w:val="num" w:pos="2880"/>
+        </w:tabs>
+        <w:ind w:left="2880" w:hanging="360"/>
+      </w:pPr>
+      <w:rPr>
+        <w:rFonts w:ascii="Wingdings" w:hAnsi="Wingdings" w:hint="default"/>
+        <w:sz w:val="20"/>
+      </w:rPr>
+    </w:lvl>
+    <w:lvl w:ilvl="4" w:tentative="1">
+      <w:start w:val="1"/>
+      <w:numFmt w:val="bullet"/>
+      <w:lvlText w:val=""/>
+      <w:lvlJc w:val="left"/>
+      <w:pPr>
+        <w:tabs>
+          <w:tab w:val="num" w:pos="3600"/>
+        </w:tabs>
+        <w:ind w:left="3600" w:hanging="360"/>
+      </w:pPr>
+      <w:rPr>
+        <w:rFonts w:ascii="Wingdings" w:hAnsi="Wingdings" w:hint="default"/>
+        <w:sz w:val="20"/>
+      </w:rPr>
+    </w:lvl>
+    <w:lvl w:ilvl="5" w:tentative="1">
+      <w:start w:val="1"/>
+      <w:numFmt w:val="bullet"/>
+      <w:lvlText w:val=""/>
+      <w:lvlJc w:val="left"/>
+      <w:pPr>
+        <w:tabs>
+          <w:tab w:val="num" w:pos="4320"/>
+        </w:tabs>
+        <w:ind w:left="4320" w:hanging="360"/>
+      </w:pPr>
+      <w:rPr>
+        <w:rFonts w:ascii="Wingdings" w:hAnsi="Wingdings" w:hint="default"/>
+        <w:sz w:val="20"/>
+      </w:rPr>
+    </w:lvl>
+    <w:lvl w:ilvl="6" w:tentative="1">
+      <w:start w:val="1"/>
+      <w:numFmt w:val="bullet"/>
+      <w:lvlText w:val=""/>
+      <w:lvlJc w:val="left"/>
+      <w:pPr>
+        <w:tabs>
+          <w:tab w:val="num" w:pos="5040"/>
+        </w:tabs>
+        <w:ind w:left="5040" w:hanging="360"/>
+      </w:pPr>
+      <w:rPr>
+        <w:rFonts w:ascii="Wingdings" w:hAnsi="Wingdings" w:hint="default"/>
+        <w:sz w:val="20"/>
+      </w:rPr>
+    </w:lvl>
+    <w:lvl w:ilvl="7" w:tentative="1">
+      <w:start w:val="1"/>
+      <w:numFmt w:val="bullet"/>
+      <w:lvlText w:val=""/>
+      <w:lvlJc w:val="left"/>
+      <w:pPr>
+        <w:tabs>
+          <w:tab w:val="num" w:pos="5760"/>
+        </w:tabs>
+        <w:ind w:left="5760" w:hanging="360"/>
+      </w:pPr>
+      <w:rPr>
+        <w:rFonts w:ascii="Wingdings" w:hAnsi="Wingdings" w:hint="default"/>
+        <w:sz w:val="20"/>
+      </w:rPr>
+    </w:lvl>
+    <w:lvl w:ilvl="8" w:tentative="1">
+      <w:start w:val="1"/>
+      <w:numFmt w:val="bullet"/>
+      <w:lvlText w:val=""/>
+      <w:lvlJc w:val="left"/>
+      <w:pPr>
+        <w:tabs>
+          <w:tab w:val="num" w:pos="6480"/>
+        </w:tabs>
+        <w:ind w:left="6480" w:hanging="360"/>
+      </w:pPr>
+      <w:rPr>
+        <w:rFonts w:ascii="Wingdings" w:hAnsi="Wingdings" w:hint="default"/>
+        <w:sz w:val="20"/>
+      </w:rPr>
+    </w:lvl>
+  </w:abstractNum>
+  <w:abstractNum w:abstractNumId="13" w15:restartNumberingAfterBreak="0">
     <w:nsid w:val="64B6760E"/>
     <w:multiLevelType w:val="multilevel"/>
     <w:tmpl w:val="705CE0DA"/>
@@ -2913,7 +5433,7 @@
       </w:rPr>
     </w:lvl>
   </w:abstractNum>
-  <w:abstractNum w:abstractNumId="6" w15:restartNumberingAfterBreak="0">
+  <w:abstractNum w:abstractNumId="14" w15:restartNumberingAfterBreak="0">
     <w:nsid w:val="6E881D1E"/>
     <w:multiLevelType w:val="multilevel"/>
     <w:tmpl w:val="59B4D6C8"/>
@@ -3062,7 +5582,156 @@
       </w:rPr>
     </w:lvl>
   </w:abstractNum>
-  <w:abstractNum w:abstractNumId="7" w15:restartNumberingAfterBreak="0">
+  <w:abstractNum w:abstractNumId="15" w15:restartNumberingAfterBreak="0">
+    <w:nsid w:val="70997CA0"/>
+    <w:multiLevelType w:val="multilevel"/>
+    <w:tmpl w:val="AE26707A"/>
+    <w:lvl w:ilvl="0">
+      <w:start w:val="1"/>
+      <w:numFmt w:val="bullet"/>
+      <w:lvlText w:val=""/>
+      <w:lvlJc w:val="left"/>
+      <w:pPr>
+        <w:tabs>
+          <w:tab w:val="num" w:pos="720"/>
+        </w:tabs>
+        <w:ind w:left="720" w:hanging="360"/>
+      </w:pPr>
+      <w:rPr>
+        <w:rFonts w:ascii="Symbol" w:hAnsi="Symbol" w:hint="default"/>
+        <w:sz w:val="20"/>
+      </w:rPr>
+    </w:lvl>
+    <w:lvl w:ilvl="1" w:tentative="1">
+      <w:start w:val="1"/>
+      <w:numFmt w:val="bullet"/>
+      <w:lvlText w:val="o"/>
+      <w:lvlJc w:val="left"/>
+      <w:pPr>
+        <w:tabs>
+          <w:tab w:val="num" w:pos="1440"/>
+        </w:tabs>
+        <w:ind w:left="1440" w:hanging="360"/>
+      </w:pPr>
+      <w:rPr>
+        <w:rFonts w:ascii="Courier New" w:hAnsi="Courier New" w:hint="default"/>
+        <w:sz w:val="20"/>
+      </w:rPr>
+    </w:lvl>
+    <w:lvl w:ilvl="2" w:tentative="1">
+      <w:start w:val="1"/>
+      <w:numFmt w:val="bullet"/>
+      <w:lvlText w:val=""/>
+      <w:lvlJc w:val="left"/>
+      <w:pPr>
+        <w:tabs>
+          <w:tab w:val="num" w:pos="2160"/>
+        </w:tabs>
+        <w:ind w:left="2160" w:hanging="360"/>
+      </w:pPr>
+      <w:rPr>
+        <w:rFonts w:ascii="Wingdings" w:hAnsi="Wingdings" w:hint="default"/>
+        <w:sz w:val="20"/>
+      </w:rPr>
+    </w:lvl>
+    <w:lvl w:ilvl="3" w:tentative="1">
+      <w:start w:val="1"/>
+      <w:numFmt w:val="bullet"/>
+      <w:lvlText w:val=""/>
+      <w:lvlJc w:val="left"/>
+      <w:pPr>
+        <w:tabs>
+          <w:tab w:val="num" w:pos="2880"/>
+        </w:tabs>
+        <w:ind w:left="2880" w:hanging="360"/>
+      </w:pPr>
+      <w:rPr>
+        <w:rFonts w:ascii="Wingdings" w:hAnsi="Wingdings" w:hint="default"/>
+        <w:sz w:val="20"/>
+      </w:rPr>
+    </w:lvl>
+    <w:lvl w:ilvl="4" w:tentative="1">
+      <w:start w:val="1"/>
+      <w:numFmt w:val="bullet"/>
+      <w:lvlText w:val=""/>
+      <w:lvlJc w:val="left"/>
+      <w:pPr>
+        <w:tabs>
+          <w:tab w:val="num" w:pos="3600"/>
+        </w:tabs>
+        <w:ind w:left="3600" w:hanging="360"/>
+      </w:pPr>
+      <w:rPr>
+        <w:rFonts w:ascii="Wingdings" w:hAnsi="Wingdings" w:hint="default"/>
+        <w:sz w:val="20"/>
+      </w:rPr>
+    </w:lvl>
+    <w:lvl w:ilvl="5" w:tentative="1">
+      <w:start w:val="1"/>
+      <w:numFmt w:val="bullet"/>
+      <w:lvlText w:val=""/>
+      <w:lvlJc w:val="left"/>
+      <w:pPr>
+        <w:tabs>
+          <w:tab w:val="num" w:pos="4320"/>
+        </w:tabs>
+        <w:ind w:left="4320" w:hanging="360"/>
+      </w:pPr>
+      <w:rPr>
+        <w:rFonts w:ascii="Wingdings" w:hAnsi="Wingdings" w:hint="default"/>
+        <w:sz w:val="20"/>
+      </w:rPr>
+    </w:lvl>
+    <w:lvl w:ilvl="6" w:tentative="1">
+      <w:start w:val="1"/>
+      <w:numFmt w:val="bullet"/>
+      <w:lvlText w:val=""/>
+      <w:lvlJc w:val="left"/>
+      <w:pPr>
+        <w:tabs>
+          <w:tab w:val="num" w:pos="5040"/>
+        </w:tabs>
+        <w:ind w:left="5040" w:hanging="360"/>
+      </w:pPr>
+      <w:rPr>
+        <w:rFonts w:ascii="Wingdings" w:hAnsi="Wingdings" w:hint="default"/>
+        <w:sz w:val="20"/>
+      </w:rPr>
+    </w:lvl>
+    <w:lvl w:ilvl="7" w:tentative="1">
+      <w:start w:val="1"/>
+      <w:numFmt w:val="bullet"/>
+      <w:lvlText w:val=""/>
+      <w:lvlJc w:val="left"/>
+      <w:pPr>
+        <w:tabs>
+          <w:tab w:val="num" w:pos="5760"/>
+        </w:tabs>
+        <w:ind w:left="5760" w:hanging="360"/>
+      </w:pPr>
+      <w:rPr>
+        <w:rFonts w:ascii="Wingdings" w:hAnsi="Wingdings" w:hint="default"/>
+        <w:sz w:val="20"/>
+      </w:rPr>
+    </w:lvl>
+    <w:lvl w:ilvl="8" w:tentative="1">
+      <w:start w:val="1"/>
+      <w:numFmt w:val="bullet"/>
+      <w:lvlText w:val=""/>
+      <w:lvlJc w:val="left"/>
+      <w:pPr>
+        <w:tabs>
+          <w:tab w:val="num" w:pos="6480"/>
+        </w:tabs>
+        <w:ind w:left="6480" w:hanging="360"/>
+      </w:pPr>
+      <w:rPr>
+        <w:rFonts w:ascii="Wingdings" w:hAnsi="Wingdings" w:hint="default"/>
+        <w:sz w:val="20"/>
+      </w:rPr>
+    </w:lvl>
+  </w:abstractNum>
+  <w:abstractNum w:abstractNumId="16" w15:restartNumberingAfterBreak="0">
     <w:nsid w:val="713838E1"/>
     <w:multiLevelType w:val="multilevel"/>
     <w:tmpl w:val="8168E1D6"/>
@@ -3212,28 +5881,55 @@
     </w:lvl>
   </w:abstractNum>
   <w:num w:numId="1">
+    <w:abstractNumId w:val="1"/>
+  </w:num>
+  <w:num w:numId="2">
+    <w:abstractNumId w:val="16"/>
+  </w:num>
+  <w:num w:numId="3">
+    <w:abstractNumId w:val="9"/>
+  </w:num>
+  <w:num w:numId="4">
+    <w:abstractNumId w:val="8"/>
+  </w:num>
+  <w:num w:numId="5">
+    <w:abstractNumId w:val="14"/>
+  </w:num>
+  <w:num w:numId="6">
+    <w:abstractNumId w:val="4"/>
+  </w:num>
+  <w:num w:numId="7">
+    <w:abstractNumId w:val="10"/>
+  </w:num>
+  <w:num w:numId="8">
+    <w:abstractNumId w:val="13"/>
+  </w:num>
+  <w:num w:numId="9">
+    <w:abstractNumId w:val="5"/>
+  </w:num>
+  <w:num w:numId="10">
+    <w:abstractNumId w:val="15"/>
+  </w:num>
+  <w:num w:numId="11">
+    <w:abstractNumId w:val="6"/>
+  </w:num>
+  <w:num w:numId="12">
+    <w:abstractNumId w:val="7"/>
+  </w:num>
+  <w:num w:numId="13">
+    <w:abstractNumId w:val="11"/>
+  </w:num>
+  <w:num w:numId="14">
+    <w:abstractNumId w:val="2"/>
+  </w:num>
+  <w:num w:numId="15">
+    <w:abstractNumId w:val="12"/>
+  </w:num>
+  <w:num w:numId="16">
     <w:abstractNumId w:val="0"/>
   </w:num>
-  <w:num w:numId="2">
-    <w:abstractNumId w:val="7"/>
-  </w:num>
-  <w:num w:numId="3">
+  <w:num w:numId="17">
     <w:abstractNumId w:val="3"/>
-  </w:num>
-  <w:num w:numId="4">
-    <w:abstractNumId w:val="2"/>
-  </w:num>
-  <w:num w:numId="5">
-    <w:abstractNumId w:val="6"/>
-  </w:num>
-  <w:num w:numId="6">
-    <w:abstractNumId w:val="1"/>
-  </w:num>
-  <w:num w:numId="7">
-    <w:abstractNumId w:val="4"/>
-  </w:num>
-  <w:num w:numId="8">
-    <w:abstractNumId w:val="5"/>
   </w:num>
 </w:numbering>
 </file>

</xml_diff>